<commit_message>
Update the week 1 and 2 reports after the instructor has provided feedback
</commit_message>
<xml_diff>
--- a/Phiếu phân công nhiệm vụ 1.docx
+++ b/Phiếu phân công nhiệm vụ 1.docx
@@ -81,7 +81,6 @@
         <w:rPr>
           <w:rFonts w:asciiTheme="majorHAnsi" w:hAnsiTheme="majorHAnsi" w:cstheme="majorHAnsi"/>
           <w:szCs w:val="26"/>
-          <w:lang w:val="en-US"/>
         </w:rPr>
         <w:t>18</w:t>
       </w:r>
@@ -367,10 +366,10 @@
         <w:tblLook w:val="04A0" w:firstRow="1" w:lastRow="0" w:firstColumn="1" w:lastColumn="0" w:noHBand="0" w:noVBand="1"/>
       </w:tblPr>
       <w:tblGrid>
-        <w:gridCol w:w="809"/>
+        <w:gridCol w:w="811"/>
         <w:gridCol w:w="2303"/>
-        <w:gridCol w:w="5510"/>
-        <w:gridCol w:w="5644"/>
+        <w:gridCol w:w="5511"/>
+        <w:gridCol w:w="5646"/>
       </w:tblGrid>
       <w:tr>
         <w:trPr>
@@ -381,7 +380,7 @@
             <w:tcW w:w="284" w:type="pct"/>
             <w:tcBorders>
               <w:top w:val="single" w:sz="8" w:space="0" w:color="auto"/>
-              <w:left w:val="single" w:sz="8" w:space="0" w:color="auto"/>
+              <w:left w:val="single" w:sz="4" w:space="0" w:color="auto"/>
               <w:bottom w:val="single" w:sz="8" w:space="0" w:color="auto"/>
             </w:tcBorders>
             <w:vAlign w:val="center"/>
@@ -389,7 +388,7 @@
           </w:tcPr>
           <w:p>
             <w:pPr>
-              <w:spacing w:line="26" w:lineRule="atLeast"/>
+              <w:spacing w:before="60" w:after="60" w:line="26" w:lineRule="atLeast"/>
               <w:rPr>
                 <w:rFonts w:asciiTheme="majorHAnsi" w:eastAsia="Times New Roman" w:hAnsiTheme="majorHAnsi" w:cstheme="majorHAnsi"/>
                 <w:b/>
@@ -422,7 +421,7 @@
           </w:tcPr>
           <w:p>
             <w:pPr>
-              <w:spacing w:line="26" w:lineRule="atLeast"/>
+              <w:spacing w:before="60" w:after="60" w:line="26" w:lineRule="atLeast"/>
               <w:rPr>
                 <w:rFonts w:asciiTheme="majorHAnsi" w:eastAsia="Times New Roman" w:hAnsiTheme="majorHAnsi" w:cstheme="majorHAnsi"/>
                 <w:b/>
@@ -455,7 +454,7 @@
           </w:tcPr>
           <w:p>
             <w:pPr>
-              <w:spacing w:line="26" w:lineRule="atLeast"/>
+              <w:spacing w:before="60" w:after="60" w:line="26" w:lineRule="atLeast"/>
               <w:rPr>
                 <w:rFonts w:asciiTheme="majorHAnsi" w:eastAsia="Times New Roman" w:hAnsiTheme="majorHAnsi" w:cstheme="majorHAnsi"/>
                 <w:b/>
@@ -489,7 +488,7 @@
           </w:tcPr>
           <w:p>
             <w:pPr>
-              <w:spacing w:line="26" w:lineRule="atLeast"/>
+              <w:spacing w:before="60" w:after="60" w:line="26" w:lineRule="atLeast"/>
               <w:rPr>
                 <w:rFonts w:asciiTheme="majorHAnsi" w:eastAsia="Times New Roman" w:hAnsiTheme="majorHAnsi" w:cstheme="majorHAnsi"/>
                 <w:b/>
@@ -521,93 +520,99 @@
             <w:vMerge w:val="restart"/>
             <w:tcBorders>
               <w:top w:val="single" w:sz="8" w:space="0" w:color="auto"/>
+              <w:left w:val="single" w:sz="4" w:space="0" w:color="auto"/>
+            </w:tcBorders>
+            <w:vAlign w:val="center"/>
+            <w:hideMark/>
+          </w:tcPr>
+          <w:p>
+            <w:pPr>
+              <w:spacing w:before="60" w:after="60" w:line="26" w:lineRule="atLeast"/>
+              <w:jc w:val="center"/>
+              <w:rPr>
+                <w:rFonts w:asciiTheme="majorHAnsi" w:eastAsia="Times New Roman" w:hAnsiTheme="majorHAnsi" w:cstheme="majorHAnsi"/>
+                <w:szCs w:val="26"/>
+                <w:lang w:val="vi-VN" w:eastAsia="vi-VN"/>
+              </w:rPr>
+            </w:pPr>
+            <w:r>
+              <w:rPr>
+                <w:rFonts w:asciiTheme="majorHAnsi" w:eastAsia="Times New Roman" w:hAnsiTheme="majorHAnsi" w:cstheme="majorHAnsi"/>
+                <w:szCs w:val="26"/>
+                <w:lang w:val="vi-VN" w:eastAsia="vi-VN"/>
+              </w:rPr>
+              <w:t>1</w:t>
+            </w:r>
+          </w:p>
+        </w:tc>
+        <w:tc>
+          <w:tcPr>
+            <w:tcW w:w="807" w:type="pct"/>
+            <w:tcBorders>
+              <w:top w:val="single" w:sz="8" w:space="0" w:color="auto"/>
+              <w:right w:val="single" w:sz="4" w:space="0" w:color="auto"/>
+            </w:tcBorders>
+            <w:vAlign w:val="center"/>
+            <w:hideMark/>
+          </w:tcPr>
+          <w:p>
+            <w:pPr>
+              <w:spacing w:before="60" w:after="60" w:line="26" w:lineRule="atLeast"/>
+              <w:rPr>
+                <w:rFonts w:asciiTheme="majorHAnsi" w:eastAsia="Times New Roman" w:hAnsiTheme="majorHAnsi" w:cstheme="majorHAnsi"/>
+                <w:szCs w:val="26"/>
+                <w:lang w:val="vi-VN" w:eastAsia="vi-VN"/>
+              </w:rPr>
+            </w:pPr>
+            <w:r>
+              <w:rPr>
+                <w:rFonts w:asciiTheme="majorHAnsi" w:eastAsia="Times New Roman" w:hAnsiTheme="majorHAnsi" w:cstheme="majorHAnsi"/>
+                <w:szCs w:val="26"/>
+                <w:lang w:val="vi-VN" w:eastAsia="vi-VN"/>
+              </w:rPr>
+              <w:t>Giàng Seo Chính</w:t>
+            </w:r>
+          </w:p>
+        </w:tc>
+        <w:tc>
+          <w:tcPr>
+            <w:tcW w:w="1931" w:type="pct"/>
+            <w:tcBorders>
+              <w:top w:val="single" w:sz="8" w:space="0" w:color="auto"/>
+              <w:left w:val="single" w:sz="4" w:space="0" w:color="auto"/>
+              <w:bottom w:val="single" w:sz="4" w:space="0" w:color="auto"/>
+              <w:right w:val="single" w:sz="8" w:space="0" w:color="auto"/>
+            </w:tcBorders>
+            <w:vAlign w:val="center"/>
+            <w:hideMark/>
+          </w:tcPr>
+          <w:p>
+            <w:pPr>
+              <w:spacing w:before="60" w:after="60" w:line="26" w:lineRule="atLeast"/>
+              <w:jc w:val="both"/>
+              <w:rPr>
+                <w:rFonts w:asciiTheme="majorHAnsi" w:eastAsia="Times New Roman" w:hAnsiTheme="majorHAnsi" w:cstheme="majorHAnsi"/>
+                <w:szCs w:val="26"/>
+                <w:lang w:val="vi-VN" w:eastAsia="vi-VN"/>
+              </w:rPr>
+            </w:pPr>
+            <w:r>
+              <w:rPr>
+                <w:rFonts w:asciiTheme="majorHAnsi" w:eastAsia="Times New Roman" w:hAnsiTheme="majorHAnsi" w:cstheme="majorHAnsi"/>
+                <w:szCs w:val="26"/>
+                <w:lang w:val="vi-VN" w:eastAsia="vi-VN"/>
+              </w:rPr>
+              <w:t>Phân công nhiêm vụ cho các thành viên trong nhóm, xây dụng cấu trúc báo cáo, hoàn thiện các phiếu báo cáo.</w:t>
+            </w:r>
+          </w:p>
+        </w:tc>
+        <w:tc>
+          <w:tcPr>
+            <w:tcW w:w="1978" w:type="pct"/>
+            <w:tcBorders>
+              <w:top w:val="single" w:sz="8" w:space="0" w:color="auto"/>
               <w:left w:val="single" w:sz="8" w:space="0" w:color="auto"/>
-            </w:tcBorders>
-            <w:vAlign w:val="center"/>
-            <w:hideMark/>
-          </w:tcPr>
-          <w:p>
-            <w:pPr>
-              <w:spacing w:line="26" w:lineRule="atLeast"/>
-              <w:jc w:val="center"/>
-              <w:rPr>
-                <w:rFonts w:asciiTheme="majorHAnsi" w:eastAsia="Times New Roman" w:hAnsiTheme="majorHAnsi" w:cstheme="majorHAnsi"/>
-                <w:szCs w:val="26"/>
-                <w:lang w:val="vi-VN" w:eastAsia="vi-VN"/>
-              </w:rPr>
-            </w:pPr>
-            <w:r>
-              <w:rPr>
-                <w:rFonts w:asciiTheme="majorHAnsi" w:eastAsia="Times New Roman" w:hAnsiTheme="majorHAnsi" w:cstheme="majorHAnsi"/>
-                <w:szCs w:val="26"/>
-                <w:lang w:val="vi-VN" w:eastAsia="vi-VN"/>
-              </w:rPr>
-              <w:t>1</w:t>
-            </w:r>
-          </w:p>
-        </w:tc>
-        <w:tc>
-          <w:tcPr>
-            <w:tcW w:w="807" w:type="pct"/>
-            <w:tcBorders>
-              <w:top w:val="single" w:sz="8" w:space="0" w:color="auto"/>
-            </w:tcBorders>
-            <w:vAlign w:val="center"/>
-            <w:hideMark/>
-          </w:tcPr>
-          <w:p>
-            <w:pPr>
-              <w:spacing w:line="26" w:lineRule="atLeast"/>
-              <w:rPr>
-                <w:rFonts w:asciiTheme="majorHAnsi" w:eastAsia="Times New Roman" w:hAnsiTheme="majorHAnsi" w:cstheme="majorHAnsi"/>
-                <w:szCs w:val="26"/>
-                <w:lang w:val="vi-VN" w:eastAsia="vi-VN"/>
-              </w:rPr>
-            </w:pPr>
-            <w:r>
-              <w:rPr>
-                <w:rFonts w:asciiTheme="majorHAnsi" w:eastAsia="Times New Roman" w:hAnsiTheme="majorHAnsi" w:cstheme="majorHAnsi"/>
-                <w:szCs w:val="26"/>
-                <w:lang w:val="vi-VN" w:eastAsia="vi-VN"/>
-              </w:rPr>
-              <w:t>Giàng Seo Chính</w:t>
-            </w:r>
-          </w:p>
-        </w:tc>
-        <w:tc>
-          <w:tcPr>
-            <w:tcW w:w="1931" w:type="pct"/>
-            <w:tcBorders>
-              <w:top w:val="single" w:sz="8" w:space="0" w:color="auto"/>
-            </w:tcBorders>
-            <w:vAlign w:val="center"/>
-            <w:hideMark/>
-          </w:tcPr>
-          <w:p>
-            <w:pPr>
-              <w:spacing w:line="26" w:lineRule="atLeast"/>
-              <w:jc w:val="both"/>
-              <w:rPr>
-                <w:rFonts w:asciiTheme="majorHAnsi" w:eastAsia="Times New Roman" w:hAnsiTheme="majorHAnsi" w:cstheme="majorHAnsi"/>
-                <w:szCs w:val="26"/>
-                <w:lang w:val="vi-VN" w:eastAsia="vi-VN"/>
-              </w:rPr>
-            </w:pPr>
-            <w:r>
-              <w:rPr>
-                <w:rFonts w:asciiTheme="majorHAnsi" w:eastAsia="Times New Roman" w:hAnsiTheme="majorHAnsi" w:cstheme="majorHAnsi"/>
-                <w:szCs w:val="26"/>
-                <w:lang w:val="vi-VN" w:eastAsia="vi-VN"/>
-              </w:rPr>
-              <w:t>Phân công nhiêm vụ cho các thành viên trong nhóm, xây dụng cấu trúc báo cáo, hoàn thiện các phiếu báo cáo.</w:t>
-            </w:r>
-          </w:p>
-        </w:tc>
-        <w:tc>
-          <w:tcPr>
-            <w:tcW w:w="1978" w:type="pct"/>
-            <w:tcBorders>
-              <w:top w:val="single" w:sz="8" w:space="0" w:color="auto"/>
+              <w:bottom w:val="single" w:sz="8" w:space="0" w:color="auto"/>
               <w:right w:val="single" w:sz="8" w:space="0" w:color="auto"/>
             </w:tcBorders>
             <w:vAlign w:val="center"/>
@@ -615,7 +620,7 @@
           </w:tcPr>
           <w:p>
             <w:pPr>
-              <w:spacing w:line="26" w:lineRule="atLeast"/>
+              <w:spacing w:before="60" w:after="60" w:line="26" w:lineRule="atLeast"/>
               <w:jc w:val="both"/>
               <w:rPr>
                 <w:rFonts w:asciiTheme="majorHAnsi" w:eastAsia="Times New Roman" w:hAnsiTheme="majorHAnsi" w:cstheme="majorHAnsi"/>
@@ -643,14 +648,14 @@
             <w:tcW w:w="284" w:type="pct"/>
             <w:vMerge/>
             <w:tcBorders>
-              <w:left w:val="single" w:sz="8" w:space="0" w:color="auto"/>
-            </w:tcBorders>
-            <w:vAlign w:val="center"/>
-            <w:hideMark/>
-          </w:tcPr>
-          <w:p>
-            <w:pPr>
-              <w:spacing w:line="26" w:lineRule="atLeast"/>
+              <w:left w:val="single" w:sz="4" w:space="0" w:color="auto"/>
+            </w:tcBorders>
+            <w:vAlign w:val="center"/>
+            <w:hideMark/>
+          </w:tcPr>
+          <w:p>
+            <w:pPr>
+              <w:spacing w:before="60" w:after="60" w:line="26" w:lineRule="atLeast"/>
               <w:jc w:val="center"/>
               <w:rPr>
                 <w:rFonts w:asciiTheme="majorHAnsi" w:eastAsia="Times New Roman" w:hAnsiTheme="majorHAnsi" w:cstheme="majorHAnsi"/>
@@ -668,7 +673,7 @@
           </w:tcPr>
           <w:p>
             <w:pPr>
-              <w:spacing w:line="26" w:lineRule="atLeast"/>
+              <w:spacing w:before="60" w:after="60" w:line="26" w:lineRule="atLeast"/>
               <w:rPr>
                 <w:rFonts w:asciiTheme="majorHAnsi" w:eastAsia="Times New Roman" w:hAnsiTheme="majorHAnsi" w:cstheme="majorHAnsi"/>
                 <w:szCs w:val="26"/>
@@ -688,12 +693,15 @@
         <w:tc>
           <w:tcPr>
             <w:tcW w:w="1931" w:type="pct"/>
-            <w:vAlign w:val="center"/>
-            <w:hideMark/>
-          </w:tcPr>
-          <w:p>
-            <w:pPr>
-              <w:spacing w:line="26" w:lineRule="atLeast"/>
+            <w:tcBorders>
+              <w:top w:val="single" w:sz="4" w:space="0" w:color="auto"/>
+            </w:tcBorders>
+            <w:vAlign w:val="center"/>
+            <w:hideMark/>
+          </w:tcPr>
+          <w:p>
+            <w:pPr>
+              <w:spacing w:before="60" w:after="60" w:line="26" w:lineRule="atLeast"/>
               <w:jc w:val="both"/>
               <w:rPr>
                 <w:rFonts w:asciiTheme="majorHAnsi" w:eastAsia="Times New Roman" w:hAnsiTheme="majorHAnsi" w:cstheme="majorHAnsi"/>
@@ -715,6 +723,7 @@
           <w:tcPr>
             <w:tcW w:w="1978" w:type="pct"/>
             <w:tcBorders>
+              <w:top w:val="single" w:sz="8" w:space="0" w:color="auto"/>
               <w:right w:val="single" w:sz="8" w:space="0" w:color="auto"/>
             </w:tcBorders>
             <w:vAlign w:val="center"/>
@@ -722,7 +731,7 @@
           </w:tcPr>
           <w:p>
             <w:pPr>
-              <w:spacing w:line="26" w:lineRule="atLeast"/>
+              <w:spacing w:before="60" w:after="60" w:line="26" w:lineRule="atLeast"/>
               <w:jc w:val="both"/>
               <w:rPr>
                 <w:rFonts w:asciiTheme="majorHAnsi" w:eastAsia="Times New Roman" w:hAnsiTheme="majorHAnsi" w:cstheme="majorHAnsi"/>
@@ -750,14 +759,14 @@
             <w:tcW w:w="284" w:type="pct"/>
             <w:vMerge/>
             <w:tcBorders>
-              <w:left w:val="single" w:sz="8" w:space="0" w:color="auto"/>
-            </w:tcBorders>
-            <w:vAlign w:val="center"/>
-            <w:hideMark/>
-          </w:tcPr>
-          <w:p>
-            <w:pPr>
-              <w:spacing w:line="26" w:lineRule="atLeast"/>
+              <w:left w:val="single" w:sz="4" w:space="0" w:color="auto"/>
+            </w:tcBorders>
+            <w:vAlign w:val="center"/>
+            <w:hideMark/>
+          </w:tcPr>
+          <w:p>
+            <w:pPr>
+              <w:spacing w:before="60" w:after="60" w:line="26" w:lineRule="atLeast"/>
               <w:jc w:val="center"/>
               <w:rPr>
                 <w:rFonts w:asciiTheme="majorHAnsi" w:eastAsia="Times New Roman" w:hAnsiTheme="majorHAnsi" w:cstheme="majorHAnsi"/>
@@ -775,7 +784,7 @@
           </w:tcPr>
           <w:p>
             <w:pPr>
-              <w:spacing w:line="26" w:lineRule="atLeast"/>
+              <w:spacing w:before="60" w:after="60" w:line="26" w:lineRule="atLeast"/>
               <w:rPr>
                 <w:rFonts w:asciiTheme="majorHAnsi" w:eastAsia="Times New Roman" w:hAnsiTheme="majorHAnsi" w:cstheme="majorHAnsi"/>
                 <w:szCs w:val="26"/>
@@ -800,7 +809,7 @@
           </w:tcPr>
           <w:p>
             <w:pPr>
-              <w:spacing w:line="26" w:lineRule="atLeast"/>
+              <w:spacing w:before="60" w:after="60" w:line="26" w:lineRule="atLeast"/>
               <w:jc w:val="both"/>
               <w:rPr>
                 <w:rFonts w:asciiTheme="majorHAnsi" w:eastAsia="Times New Roman" w:hAnsiTheme="majorHAnsi" w:cstheme="majorHAnsi"/>
@@ -829,7 +838,7 @@
           </w:tcPr>
           <w:p>
             <w:pPr>
-              <w:spacing w:line="26" w:lineRule="atLeast"/>
+              <w:spacing w:before="60" w:after="60" w:line="26" w:lineRule="atLeast"/>
               <w:jc w:val="both"/>
               <w:rPr>
                 <w:rFonts w:asciiTheme="majorHAnsi" w:eastAsia="Times New Roman" w:hAnsiTheme="majorHAnsi" w:cstheme="majorHAnsi"/>
@@ -857,14 +866,14 @@
             <w:tcW w:w="284" w:type="pct"/>
             <w:vMerge/>
             <w:tcBorders>
-              <w:left w:val="single" w:sz="8" w:space="0" w:color="auto"/>
-            </w:tcBorders>
-            <w:vAlign w:val="center"/>
-            <w:hideMark/>
-          </w:tcPr>
-          <w:p>
-            <w:pPr>
-              <w:spacing w:line="26" w:lineRule="atLeast"/>
+              <w:left w:val="single" w:sz="4" w:space="0" w:color="auto"/>
+            </w:tcBorders>
+            <w:vAlign w:val="center"/>
+            <w:hideMark/>
+          </w:tcPr>
+          <w:p>
+            <w:pPr>
+              <w:spacing w:before="60" w:after="60" w:line="26" w:lineRule="atLeast"/>
               <w:jc w:val="center"/>
               <w:rPr>
                 <w:rFonts w:asciiTheme="majorHAnsi" w:eastAsia="Times New Roman" w:hAnsiTheme="majorHAnsi" w:cstheme="majorHAnsi"/>
@@ -882,7 +891,7 @@
           </w:tcPr>
           <w:p>
             <w:pPr>
-              <w:spacing w:line="26" w:lineRule="atLeast"/>
+              <w:spacing w:before="60" w:after="60" w:line="26" w:lineRule="atLeast"/>
               <w:rPr>
                 <w:rFonts w:asciiTheme="majorHAnsi" w:eastAsia="Times New Roman" w:hAnsiTheme="majorHAnsi" w:cstheme="majorHAnsi"/>
                 <w:szCs w:val="26"/>
@@ -907,7 +916,7 @@
           </w:tcPr>
           <w:p>
             <w:pPr>
-              <w:spacing w:line="26" w:lineRule="atLeast"/>
+              <w:spacing w:before="60" w:after="60" w:line="26" w:lineRule="atLeast"/>
               <w:jc w:val="both"/>
               <w:rPr>
                 <w:rFonts w:asciiTheme="majorHAnsi" w:eastAsia="Times New Roman" w:hAnsiTheme="majorHAnsi" w:cstheme="majorHAnsi"/>
@@ -936,7 +945,7 @@
           </w:tcPr>
           <w:p>
             <w:pPr>
-              <w:spacing w:line="26" w:lineRule="atLeast"/>
+              <w:spacing w:before="60" w:after="60" w:line="26" w:lineRule="atLeast"/>
               <w:jc w:val="both"/>
               <w:rPr>
                 <w:rFonts w:asciiTheme="majorHAnsi" w:eastAsia="Times New Roman" w:hAnsiTheme="majorHAnsi" w:cstheme="majorHAnsi"/>
@@ -964,7 +973,7 @@
             <w:tcW w:w="284" w:type="pct"/>
             <w:vMerge/>
             <w:tcBorders>
-              <w:left w:val="single" w:sz="8" w:space="0" w:color="auto"/>
+              <w:left w:val="single" w:sz="4" w:space="0" w:color="auto"/>
               <w:bottom w:val="single" w:sz="8" w:space="0" w:color="auto"/>
             </w:tcBorders>
             <w:vAlign w:val="center"/>
@@ -972,7 +981,7 @@
           </w:tcPr>
           <w:p>
             <w:pPr>
-              <w:spacing w:line="26" w:lineRule="atLeast"/>
+              <w:spacing w:before="60" w:after="60" w:line="26" w:lineRule="atLeast"/>
               <w:jc w:val="center"/>
               <w:rPr>
                 <w:rFonts w:asciiTheme="majorHAnsi" w:eastAsia="Times New Roman" w:hAnsiTheme="majorHAnsi" w:cstheme="majorHAnsi"/>
@@ -993,7 +1002,7 @@
           </w:tcPr>
           <w:p>
             <w:pPr>
-              <w:spacing w:line="26" w:lineRule="atLeast"/>
+              <w:spacing w:before="60" w:after="60" w:line="26" w:lineRule="atLeast"/>
               <w:rPr>
                 <w:rFonts w:asciiTheme="majorHAnsi" w:eastAsia="Times New Roman" w:hAnsiTheme="majorHAnsi" w:cstheme="majorHAnsi"/>
                 <w:szCs w:val="26"/>
@@ -1021,7 +1030,7 @@
           </w:tcPr>
           <w:p>
             <w:pPr>
-              <w:spacing w:line="26" w:lineRule="atLeast"/>
+              <w:spacing w:before="60" w:after="60" w:line="26" w:lineRule="atLeast"/>
               <w:jc w:val="both"/>
               <w:rPr>
                 <w:rFonts w:asciiTheme="majorHAnsi" w:eastAsia="Times New Roman" w:hAnsiTheme="majorHAnsi" w:cstheme="majorHAnsi"/>
@@ -1051,7 +1060,7 @@
           </w:tcPr>
           <w:p>
             <w:pPr>
-              <w:spacing w:line="26" w:lineRule="atLeast"/>
+              <w:spacing w:before="60" w:after="60" w:line="26" w:lineRule="atLeast"/>
               <w:jc w:val="both"/>
               <w:rPr>
                 <w:rFonts w:asciiTheme="majorHAnsi" w:eastAsia="Times New Roman" w:hAnsiTheme="majorHAnsi" w:cstheme="majorHAnsi"/>
@@ -1087,7 +1096,7 @@
           </w:tcPr>
           <w:p>
             <w:pPr>
-              <w:spacing w:line="26" w:lineRule="atLeast"/>
+              <w:spacing w:before="60" w:after="60" w:line="26" w:lineRule="atLeast"/>
               <w:jc w:val="center"/>
               <w:rPr>
                 <w:rFonts w:asciiTheme="majorHAnsi" w:eastAsia="Times New Roman" w:hAnsiTheme="majorHAnsi" w:cstheme="majorHAnsi"/>
@@ -1117,7 +1126,7 @@
           </w:tcPr>
           <w:p>
             <w:pPr>
-              <w:spacing w:line="26" w:lineRule="atLeast"/>
+              <w:spacing w:before="60" w:after="60" w:line="26" w:lineRule="atLeast"/>
               <w:rPr>
                 <w:rFonts w:asciiTheme="majorHAnsi" w:eastAsia="Times New Roman" w:hAnsiTheme="majorHAnsi" w:cstheme="majorHAnsi"/>
                 <w:szCs w:val="26"/>
@@ -1145,7 +1154,7 @@
           </w:tcPr>
           <w:p>
             <w:pPr>
-              <w:spacing w:line="26" w:lineRule="atLeast"/>
+              <w:spacing w:before="60" w:after="60" w:line="26" w:lineRule="atLeast"/>
               <w:jc w:val="both"/>
               <w:rPr>
                 <w:rFonts w:asciiTheme="majorHAnsi" w:eastAsia="Times New Roman" w:hAnsiTheme="majorHAnsi" w:cstheme="majorHAnsi"/>
@@ -1164,7 +1173,7 @@
           </w:p>
           <w:p>
             <w:pPr>
-              <w:spacing w:line="26" w:lineRule="atLeast"/>
+              <w:spacing w:before="60" w:after="60" w:line="26" w:lineRule="atLeast"/>
               <w:jc w:val="both"/>
               <w:rPr>
                 <w:rFonts w:asciiTheme="majorHAnsi" w:eastAsia="Times New Roman" w:hAnsiTheme="majorHAnsi" w:cstheme="majorHAnsi"/>
@@ -1194,7 +1203,7 @@
           </w:tcPr>
           <w:p>
             <w:pPr>
-              <w:spacing w:line="26" w:lineRule="atLeast"/>
+              <w:spacing w:before="60" w:after="60" w:line="26" w:lineRule="atLeast"/>
               <w:jc w:val="both"/>
               <w:rPr>
                 <w:rFonts w:asciiTheme="majorHAnsi" w:eastAsia="Times New Roman" w:hAnsiTheme="majorHAnsi" w:cstheme="majorHAnsi"/>
@@ -1229,7 +1238,7 @@
           </w:tcPr>
           <w:p>
             <w:pPr>
-              <w:spacing w:line="26" w:lineRule="atLeast"/>
+              <w:spacing w:before="60" w:after="60" w:line="26" w:lineRule="atLeast"/>
               <w:jc w:val="center"/>
               <w:rPr>
                 <w:rFonts w:asciiTheme="majorHAnsi" w:eastAsia="Times New Roman" w:hAnsiTheme="majorHAnsi" w:cstheme="majorHAnsi"/>
@@ -1247,7 +1256,7 @@
           </w:tcPr>
           <w:p>
             <w:pPr>
-              <w:spacing w:line="26" w:lineRule="atLeast"/>
+              <w:spacing w:before="60" w:after="60" w:line="26" w:lineRule="atLeast"/>
               <w:rPr>
                 <w:rFonts w:asciiTheme="majorHAnsi" w:eastAsia="Times New Roman" w:hAnsiTheme="majorHAnsi" w:cstheme="majorHAnsi"/>
                 <w:szCs w:val="26"/>
@@ -1272,7 +1281,7 @@
           </w:tcPr>
           <w:p>
             <w:pPr>
-              <w:spacing w:line="26" w:lineRule="atLeast"/>
+              <w:spacing w:before="60" w:after="60" w:line="26" w:lineRule="atLeast"/>
               <w:jc w:val="both"/>
               <w:rPr>
                 <w:rFonts w:asciiTheme="majorHAnsi" w:eastAsia="Times New Roman" w:hAnsiTheme="majorHAnsi" w:cstheme="majorHAnsi"/>
@@ -1301,7 +1310,7 @@
           </w:tcPr>
           <w:p>
             <w:pPr>
-              <w:spacing w:line="26" w:lineRule="atLeast"/>
+              <w:spacing w:before="60" w:after="60" w:line="26" w:lineRule="atLeast"/>
               <w:jc w:val="both"/>
               <w:rPr>
                 <w:rFonts w:asciiTheme="majorHAnsi" w:eastAsia="Times New Roman" w:hAnsiTheme="majorHAnsi" w:cstheme="majorHAnsi"/>
@@ -1336,7 +1345,7 @@
           </w:tcPr>
           <w:p>
             <w:pPr>
-              <w:spacing w:line="26" w:lineRule="atLeast"/>
+              <w:spacing w:before="60" w:after="60" w:line="26" w:lineRule="atLeast"/>
               <w:jc w:val="center"/>
               <w:rPr>
                 <w:rFonts w:asciiTheme="majorHAnsi" w:eastAsia="Times New Roman" w:hAnsiTheme="majorHAnsi" w:cstheme="majorHAnsi"/>
@@ -1354,7 +1363,7 @@
           </w:tcPr>
           <w:p>
             <w:pPr>
-              <w:spacing w:line="26" w:lineRule="atLeast"/>
+              <w:spacing w:before="60" w:after="60" w:line="26" w:lineRule="atLeast"/>
               <w:rPr>
                 <w:rFonts w:asciiTheme="majorHAnsi" w:eastAsia="Times New Roman" w:hAnsiTheme="majorHAnsi" w:cstheme="majorHAnsi"/>
                 <w:szCs w:val="26"/>
@@ -1404,7 +1413,7 @@
                 </w:tcPr>
                 <w:p>
                   <w:pPr>
-                    <w:spacing w:after="0" w:line="26" w:lineRule="atLeast"/>
+                    <w:spacing w:before="60" w:after="60" w:line="26" w:lineRule="atLeast"/>
                     <w:jc w:val="both"/>
                     <w:rPr>
                       <w:rFonts w:asciiTheme="majorHAnsi" w:eastAsia="Times New Roman" w:hAnsiTheme="majorHAnsi" w:cstheme="majorHAnsi"/>
@@ -1418,7 +1427,7 @@
           </w:tbl>
           <w:p>
             <w:pPr>
-              <w:spacing w:line="26" w:lineRule="atLeast"/>
+              <w:spacing w:before="60" w:after="60" w:line="26" w:lineRule="atLeast"/>
               <w:jc w:val="both"/>
               <w:rPr>
                 <w:rFonts w:asciiTheme="majorHAnsi" w:eastAsia="Times New Roman" w:hAnsiTheme="majorHAnsi" w:cstheme="majorHAnsi"/>
@@ -1456,7 +1465,7 @@
                 </w:tcPr>
                 <w:p>
                   <w:pPr>
-                    <w:spacing w:after="0" w:line="26" w:lineRule="atLeast"/>
+                    <w:spacing w:before="60" w:after="60" w:line="26" w:lineRule="atLeast"/>
                     <w:jc w:val="both"/>
                     <w:rPr>
                       <w:rFonts w:asciiTheme="majorHAnsi" w:eastAsia="Times New Roman" w:hAnsiTheme="majorHAnsi" w:cstheme="majorHAnsi"/>
@@ -1478,7 +1487,7 @@
           </w:tbl>
           <w:p>
             <w:pPr>
-              <w:spacing w:line="26" w:lineRule="atLeast"/>
+              <w:spacing w:before="60" w:after="60" w:line="26" w:lineRule="atLeast"/>
               <w:jc w:val="both"/>
               <w:rPr>
                 <w:rFonts w:asciiTheme="majorHAnsi" w:eastAsia="Times New Roman" w:hAnsiTheme="majorHAnsi" w:cstheme="majorHAnsi"/>
@@ -1499,7 +1508,7 @@
           </w:tcPr>
           <w:p>
             <w:pPr>
-              <w:spacing w:line="26" w:lineRule="atLeast"/>
+              <w:spacing w:before="60" w:after="60" w:line="26" w:lineRule="atLeast"/>
               <w:jc w:val="both"/>
               <w:rPr>
                 <w:rFonts w:asciiTheme="majorHAnsi" w:eastAsia="Times New Roman" w:hAnsiTheme="majorHAnsi" w:cstheme="majorHAnsi"/>
@@ -1534,7 +1543,7 @@
           </w:tcPr>
           <w:p>
             <w:pPr>
-              <w:spacing w:line="26" w:lineRule="atLeast"/>
+              <w:spacing w:before="60" w:after="60" w:line="26" w:lineRule="atLeast"/>
               <w:jc w:val="center"/>
               <w:rPr>
                 <w:rFonts w:asciiTheme="majorHAnsi" w:eastAsia="Times New Roman" w:hAnsiTheme="majorHAnsi" w:cstheme="majorHAnsi"/>
@@ -1552,7 +1561,7 @@
           </w:tcPr>
           <w:p>
             <w:pPr>
-              <w:spacing w:line="26" w:lineRule="atLeast"/>
+              <w:spacing w:before="60" w:after="60" w:line="26" w:lineRule="atLeast"/>
               <w:rPr>
                 <w:rFonts w:asciiTheme="majorHAnsi" w:eastAsia="Times New Roman" w:hAnsiTheme="majorHAnsi" w:cstheme="majorHAnsi"/>
                 <w:szCs w:val="26"/>
@@ -1577,7 +1586,7 @@
           </w:tcPr>
           <w:p>
             <w:pPr>
-              <w:spacing w:line="26" w:lineRule="atLeast"/>
+              <w:spacing w:before="60" w:after="60" w:line="26" w:lineRule="atLeast"/>
               <w:jc w:val="both"/>
               <w:rPr>
                 <w:rFonts w:asciiTheme="majorHAnsi" w:eastAsia="Times New Roman" w:hAnsiTheme="majorHAnsi" w:cstheme="majorHAnsi"/>
@@ -1606,7 +1615,7 @@
           </w:tcPr>
           <w:p>
             <w:pPr>
-              <w:spacing w:line="26" w:lineRule="atLeast"/>
+              <w:spacing w:before="60" w:after="60" w:line="26" w:lineRule="atLeast"/>
               <w:jc w:val="both"/>
               <w:rPr>
                 <w:rFonts w:asciiTheme="majorHAnsi" w:eastAsia="Times New Roman" w:hAnsiTheme="majorHAnsi" w:cstheme="majorHAnsi"/>
@@ -1642,7 +1651,7 @@
           </w:tcPr>
           <w:p>
             <w:pPr>
-              <w:spacing w:line="26" w:lineRule="atLeast"/>
+              <w:spacing w:before="60" w:after="60" w:line="26" w:lineRule="atLeast"/>
               <w:jc w:val="center"/>
               <w:rPr>
                 <w:rFonts w:asciiTheme="majorHAnsi" w:eastAsia="Times New Roman" w:hAnsiTheme="majorHAnsi" w:cstheme="majorHAnsi"/>
@@ -1663,7 +1672,7 @@
           </w:tcPr>
           <w:p>
             <w:pPr>
-              <w:spacing w:line="26" w:lineRule="atLeast"/>
+              <w:spacing w:before="60" w:after="60" w:line="26" w:lineRule="atLeast"/>
               <w:rPr>
                 <w:rFonts w:asciiTheme="majorHAnsi" w:eastAsia="Times New Roman" w:hAnsiTheme="majorHAnsi" w:cstheme="majorHAnsi"/>
                 <w:szCs w:val="26"/>
@@ -1691,7 +1700,7 @@
           </w:tcPr>
           <w:p>
             <w:pPr>
-              <w:spacing w:line="26" w:lineRule="atLeast"/>
+              <w:spacing w:before="60" w:after="60" w:line="26" w:lineRule="atLeast"/>
               <w:jc w:val="both"/>
               <w:rPr>
                 <w:rFonts w:asciiTheme="majorHAnsi" w:eastAsia="Times New Roman" w:hAnsiTheme="majorHAnsi" w:cstheme="majorHAnsi"/>
@@ -1721,7 +1730,7 @@
           </w:tcPr>
           <w:p>
             <w:pPr>
-              <w:spacing w:line="26" w:lineRule="atLeast"/>
+              <w:spacing w:before="60" w:after="60" w:line="26" w:lineRule="atLeast"/>
               <w:jc w:val="both"/>
               <w:rPr>
                 <w:rFonts w:asciiTheme="majorHAnsi" w:eastAsia="Times New Roman" w:hAnsiTheme="majorHAnsi" w:cstheme="majorHAnsi"/>
@@ -1757,7 +1766,7 @@
           </w:tcPr>
           <w:p>
             <w:pPr>
-              <w:spacing w:line="26" w:lineRule="atLeast"/>
+              <w:spacing w:before="60" w:after="60" w:line="26" w:lineRule="atLeast"/>
               <w:jc w:val="center"/>
               <w:rPr>
                 <w:rFonts w:asciiTheme="majorHAnsi" w:eastAsia="Times New Roman" w:hAnsiTheme="majorHAnsi" w:cstheme="majorHAnsi"/>
@@ -1786,7 +1795,7 @@
           </w:tcPr>
           <w:p>
             <w:pPr>
-              <w:spacing w:line="26" w:lineRule="atLeast"/>
+              <w:spacing w:before="60" w:after="60" w:line="26" w:lineRule="atLeast"/>
               <w:rPr>
                 <w:rFonts w:asciiTheme="majorHAnsi" w:eastAsia="Times New Roman" w:hAnsiTheme="majorHAnsi" w:cstheme="majorHAnsi"/>
                 <w:szCs w:val="26"/>
@@ -1806,7 +1815,6 @@
         <w:tc>
           <w:tcPr>
             <w:tcW w:w="1931" w:type="pct"/>
-            <w:vMerge w:val="restart"/>
             <w:tcBorders>
               <w:top w:val="single" w:sz="8" w:space="0" w:color="auto"/>
             </w:tcBorders>
@@ -1815,7 +1823,7 @@
           </w:tcPr>
           <w:p>
             <w:pPr>
-              <w:spacing w:line="26" w:lineRule="atLeast"/>
+              <w:spacing w:before="60" w:after="60" w:line="26" w:lineRule="atLeast"/>
               <w:jc w:val="both"/>
               <w:rPr>
                 <w:rFonts w:asciiTheme="majorHAnsi" w:eastAsia="Times New Roman" w:hAnsiTheme="majorHAnsi" w:cstheme="majorHAnsi"/>
@@ -1829,14 +1837,29 @@
                 <w:szCs w:val="26"/>
                 <w:lang w:val="vi-VN" w:eastAsia="vi-VN"/>
               </w:rPr>
-              <w:t>Phụ trách phần 2.4 cài đặt thuật toán và 2.5.1 triển khai hệ thống bằng JAVA</w:t>
+              <w:t xml:space="preserve">Phụ trách phần </w:t>
+            </w:r>
+            <w:r>
+              <w:rPr>
+                <w:rFonts w:asciiTheme="majorHAnsi" w:eastAsia="Times New Roman" w:hAnsiTheme="majorHAnsi" w:cstheme="majorHAnsi"/>
+                <w:szCs w:val="26"/>
+                <w:lang w:val="vi-VN" w:eastAsia="vi-VN"/>
+              </w:rPr>
+              <w:t>code giao diện và các hàm sinh tham số, các hàm sinh khóa, hàm mã hóa và giả mã bằng C++</w:t>
+            </w:r>
+            <w:r>
+              <w:rPr>
+                <w:rFonts w:asciiTheme="majorHAnsi" w:eastAsia="Times New Roman" w:hAnsiTheme="majorHAnsi" w:cstheme="majorHAnsi"/>
+                <w:szCs w:val="26"/>
+                <w:lang w:val="vi-VN" w:eastAsia="vi-VN"/>
+              </w:rPr>
+              <w:t xml:space="preserve"> </w:t>
             </w:r>
           </w:p>
         </w:tc>
         <w:tc>
           <w:tcPr>
             <w:tcW w:w="1978" w:type="pct"/>
-            <w:vMerge w:val="restart"/>
             <w:tcBorders>
               <w:top w:val="single" w:sz="8" w:space="0" w:color="auto"/>
               <w:right w:val="single" w:sz="8" w:space="0" w:color="auto"/>
@@ -1846,7 +1869,7 @@
           </w:tcPr>
           <w:p>
             <w:pPr>
-              <w:spacing w:line="26" w:lineRule="atLeast"/>
+              <w:spacing w:before="60" w:after="60" w:line="26" w:lineRule="atLeast"/>
               <w:jc w:val="both"/>
               <w:rPr>
                 <w:rFonts w:asciiTheme="majorHAnsi" w:eastAsia="Times New Roman" w:hAnsiTheme="majorHAnsi" w:cstheme="majorHAnsi"/>
@@ -1860,15 +1883,7 @@
                 <w:szCs w:val="26"/>
                 <w:lang w:val="vi-VN" w:eastAsia="vi-VN"/>
               </w:rPr>
-              <w:t>Sử dụng Java, BigInteger và MessageDigest để xây dựng thuật toán DSA; thiết kế giao diện Java Swing</w:t>
-            </w:r>
-            <w:r>
-              <w:rPr>
-                <w:rFonts w:asciiTheme="majorHAnsi" w:eastAsia="Times New Roman" w:hAnsiTheme="majorHAnsi" w:cstheme="majorHAnsi"/>
-                <w:szCs w:val="26"/>
-                <w:lang w:val="vi-VN" w:eastAsia="vi-VN"/>
-              </w:rPr>
-              <w:t xml:space="preserve"> </w:t>
+              <w:t xml:space="preserve">Sử dụng ngôn ngữ C++, thư viện GMP/OpenSSL để xây dựng các hàm xử lý số lớn, nghiên cứu thuật toán </w:t>
             </w:r>
             <w:r>
               <w:rPr>
@@ -1877,15 +1892,25 @@
                 <w:lang w:val="vi-VN" w:eastAsia="vi-VN"/>
               </w:rPr>
               <w:lastRenderedPageBreak/>
-              <w:t>hoặc Java FX</w:t>
-            </w:r>
-            <w:r>
-              <w:rPr>
-                <w:rFonts w:asciiTheme="majorHAnsi" w:eastAsia="Times New Roman" w:hAnsiTheme="majorHAnsi" w:cstheme="majorHAnsi"/>
-                <w:szCs w:val="26"/>
-                <w:lang w:val="vi-VN" w:eastAsia="vi-VN"/>
-              </w:rPr>
-              <w:t xml:space="preserve"> và triển khai chức năng sinh khóa, ký file và xác thực chữ ký.</w:t>
+              <w:t xml:space="preserve">DSA và tham khảo các mô hình giao diện </w:t>
+            </w:r>
+            <w:proofErr w:type="spellStart"/>
+            <w:r>
+              <w:rPr>
+                <w:rFonts w:asciiTheme="majorHAnsi" w:eastAsia="Times New Roman" w:hAnsiTheme="majorHAnsi" w:cstheme="majorHAnsi"/>
+                <w:szCs w:val="26"/>
+                <w:lang w:val="vi-VN" w:eastAsia="vi-VN"/>
+              </w:rPr>
+              <w:t>console</w:t>
+            </w:r>
+            <w:proofErr w:type="spellEnd"/>
+            <w:r>
+              <w:rPr>
+                <w:rFonts w:asciiTheme="majorHAnsi" w:eastAsia="Times New Roman" w:hAnsiTheme="majorHAnsi" w:cstheme="majorHAnsi"/>
+                <w:szCs w:val="26"/>
+                <w:lang w:val="vi-VN" w:eastAsia="vi-VN"/>
+              </w:rPr>
+              <w:t xml:space="preserve"> hoặc GUI trên Internet để hoàn thiện chương trình.</w:t>
             </w:r>
           </w:p>
         </w:tc>
@@ -1906,7 +1931,7 @@
           </w:tcPr>
           <w:p>
             <w:pPr>
-              <w:spacing w:line="26" w:lineRule="atLeast"/>
+              <w:spacing w:before="60" w:after="60" w:line="26" w:lineRule="atLeast"/>
               <w:jc w:val="center"/>
               <w:rPr>
                 <w:rFonts w:asciiTheme="majorHAnsi" w:eastAsia="Times New Roman" w:hAnsiTheme="majorHAnsi" w:cstheme="majorHAnsi"/>
@@ -1924,7 +1949,7 @@
           </w:tcPr>
           <w:p>
             <w:pPr>
-              <w:spacing w:line="26" w:lineRule="atLeast"/>
+              <w:spacing w:before="60" w:after="60" w:line="26" w:lineRule="atLeast"/>
               <w:rPr>
                 <w:rFonts w:asciiTheme="majorHAnsi" w:eastAsia="Times New Roman" w:hAnsiTheme="majorHAnsi" w:cstheme="majorHAnsi"/>
                 <w:szCs w:val="26"/>
@@ -1944,13 +1969,12 @@
         <w:tc>
           <w:tcPr>
             <w:tcW w:w="1931" w:type="pct"/>
-            <w:vMerge/>
-            <w:vAlign w:val="center"/>
-            <w:hideMark/>
-          </w:tcPr>
-          <w:p>
-            <w:pPr>
-              <w:spacing w:line="26" w:lineRule="atLeast"/>
+            <w:vAlign w:val="center"/>
+            <w:hideMark/>
+          </w:tcPr>
+          <w:p>
+            <w:pPr>
+              <w:spacing w:before="60" w:after="60" w:line="26" w:lineRule="atLeast"/>
               <w:jc w:val="both"/>
               <w:rPr>
                 <w:rFonts w:asciiTheme="majorHAnsi" w:eastAsia="Times New Roman" w:hAnsiTheme="majorHAnsi" w:cstheme="majorHAnsi"/>
@@ -1958,12 +1982,19 @@
                 <w:lang w:val="vi-VN" w:eastAsia="vi-VN"/>
               </w:rPr>
             </w:pPr>
+            <w:r>
+              <w:rPr>
+                <w:rFonts w:asciiTheme="majorHAnsi" w:eastAsia="Times New Roman" w:hAnsiTheme="majorHAnsi" w:cstheme="majorHAnsi"/>
+                <w:szCs w:val="26"/>
+                <w:lang w:val="vi-VN" w:eastAsia="vi-VN"/>
+              </w:rPr>
+              <w:t>Xây dựng giao diện hệ thống bằng JAVA</w:t>
+            </w:r>
           </w:p>
         </w:tc>
         <w:tc>
           <w:tcPr>
             <w:tcW w:w="1978" w:type="pct"/>
-            <w:vMerge/>
             <w:tcBorders>
               <w:right w:val="single" w:sz="8" w:space="0" w:color="auto"/>
             </w:tcBorders>
@@ -1972,7 +2003,7 @@
           </w:tcPr>
           <w:p>
             <w:pPr>
-              <w:spacing w:line="26" w:lineRule="atLeast"/>
+              <w:spacing w:before="60" w:after="60" w:line="26" w:lineRule="atLeast"/>
               <w:jc w:val="both"/>
               <w:rPr>
                 <w:rFonts w:asciiTheme="majorHAnsi" w:eastAsia="Times New Roman" w:hAnsiTheme="majorHAnsi" w:cstheme="majorHAnsi"/>
@@ -1980,6 +2011,14 @@
                 <w:lang w:val="vi-VN" w:eastAsia="vi-VN"/>
               </w:rPr>
             </w:pPr>
+            <w:r>
+              <w:rPr>
+                <w:rFonts w:asciiTheme="majorHAnsi" w:eastAsia="Times New Roman" w:hAnsiTheme="majorHAnsi" w:cstheme="majorHAnsi"/>
+                <w:szCs w:val="26"/>
+                <w:lang w:val="vi-VN" w:eastAsia="vi-VN"/>
+              </w:rPr>
+              <w:t>Sử dụng Java Swing hoặc JavaFX để thiết kế giao diện người dùng, tham khảo các mẫu giao diện quản lý và thực hiện kết nối các chức năng ký số, xác thực với giao diện chương trình.</w:t>
+            </w:r>
           </w:p>
         </w:tc>
       </w:tr>
@@ -1999,7 +2038,7 @@
           </w:tcPr>
           <w:p>
             <w:pPr>
-              <w:spacing w:line="26" w:lineRule="atLeast"/>
+              <w:spacing w:before="60" w:after="60" w:line="26" w:lineRule="atLeast"/>
               <w:jc w:val="center"/>
               <w:rPr>
                 <w:rFonts w:asciiTheme="majorHAnsi" w:eastAsia="Times New Roman" w:hAnsiTheme="majorHAnsi" w:cstheme="majorHAnsi"/>
@@ -2017,7 +2056,7 @@
           </w:tcPr>
           <w:p>
             <w:pPr>
-              <w:spacing w:line="26" w:lineRule="atLeast"/>
+              <w:spacing w:before="60" w:after="60" w:line="26" w:lineRule="atLeast"/>
               <w:rPr>
                 <w:rFonts w:asciiTheme="majorHAnsi" w:eastAsia="Times New Roman" w:hAnsiTheme="majorHAnsi" w:cstheme="majorHAnsi"/>
                 <w:szCs w:val="26"/>
@@ -2037,13 +2076,12 @@
         <w:tc>
           <w:tcPr>
             <w:tcW w:w="1931" w:type="pct"/>
-            <w:vMerge/>
-            <w:vAlign w:val="center"/>
-            <w:hideMark/>
-          </w:tcPr>
-          <w:p>
-            <w:pPr>
-              <w:spacing w:line="26" w:lineRule="atLeast"/>
+            <w:vAlign w:val="center"/>
+            <w:hideMark/>
+          </w:tcPr>
+          <w:p>
+            <w:pPr>
+              <w:spacing w:before="60" w:after="60" w:line="26" w:lineRule="atLeast"/>
               <w:jc w:val="both"/>
               <w:rPr>
                 <w:rFonts w:asciiTheme="majorHAnsi" w:eastAsia="Times New Roman" w:hAnsiTheme="majorHAnsi" w:cstheme="majorHAnsi"/>
@@ -2051,12 +2089,19 @@
                 <w:lang w:val="vi-VN" w:eastAsia="vi-VN"/>
               </w:rPr>
             </w:pPr>
+            <w:r>
+              <w:rPr>
+                <w:rFonts w:asciiTheme="majorHAnsi" w:eastAsia="Times New Roman" w:hAnsiTheme="majorHAnsi" w:cstheme="majorHAnsi"/>
+                <w:szCs w:val="26"/>
+                <w:lang w:val="vi-VN" w:eastAsia="vi-VN"/>
+              </w:rPr>
+              <w:t>Xây dựng hàm sinh các tham số, sinh khóa bằng JAVA</w:t>
+            </w:r>
           </w:p>
         </w:tc>
         <w:tc>
           <w:tcPr>
             <w:tcW w:w="1978" w:type="pct"/>
-            <w:vMerge/>
             <w:tcBorders>
               <w:right w:val="single" w:sz="8" w:space="0" w:color="auto"/>
             </w:tcBorders>
@@ -2065,7 +2110,7 @@
           </w:tcPr>
           <w:p>
             <w:pPr>
-              <w:spacing w:line="26" w:lineRule="atLeast"/>
+              <w:spacing w:before="60" w:after="60" w:line="26" w:lineRule="atLeast"/>
               <w:jc w:val="both"/>
               <w:rPr>
                 <w:rFonts w:asciiTheme="majorHAnsi" w:eastAsia="Times New Roman" w:hAnsiTheme="majorHAnsi" w:cstheme="majorHAnsi"/>
@@ -2073,6 +2118,14 @@
                 <w:lang w:val="vi-VN" w:eastAsia="vi-VN"/>
               </w:rPr>
             </w:pPr>
+            <w:r>
+              <w:rPr>
+                <w:rFonts w:asciiTheme="majorHAnsi" w:eastAsia="Times New Roman" w:hAnsiTheme="majorHAnsi" w:cstheme="majorHAnsi"/>
+                <w:szCs w:val="26"/>
+                <w:lang w:val="vi-VN" w:eastAsia="vi-VN"/>
+              </w:rPr>
+              <w:t>Nghiên cứu cơ chế sinh tham số p, q, g và khóa công khai/bí mật của DSA bằng Java, sử dụng BigInteger và SecureRandom để triển khai thuật toán.</w:t>
+            </w:r>
           </w:p>
         </w:tc>
       </w:tr>
@@ -2092,7 +2145,7 @@
           </w:tcPr>
           <w:p>
             <w:pPr>
-              <w:spacing w:line="26" w:lineRule="atLeast"/>
+              <w:spacing w:before="60" w:after="60" w:line="26" w:lineRule="atLeast"/>
               <w:jc w:val="center"/>
               <w:rPr>
                 <w:rFonts w:asciiTheme="majorHAnsi" w:eastAsia="Times New Roman" w:hAnsiTheme="majorHAnsi" w:cstheme="majorHAnsi"/>
@@ -2110,7 +2163,7 @@
           </w:tcPr>
           <w:p>
             <w:pPr>
-              <w:spacing w:line="26" w:lineRule="atLeast"/>
+              <w:spacing w:before="60" w:after="60" w:line="26" w:lineRule="atLeast"/>
               <w:rPr>
                 <w:rFonts w:asciiTheme="majorHAnsi" w:eastAsia="Times New Roman" w:hAnsiTheme="majorHAnsi" w:cstheme="majorHAnsi"/>
                 <w:szCs w:val="26"/>
@@ -2130,13 +2183,12 @@
         <w:tc>
           <w:tcPr>
             <w:tcW w:w="1931" w:type="pct"/>
-            <w:vMerge w:val="restart"/>
-            <w:vAlign w:val="center"/>
-            <w:hideMark/>
-          </w:tcPr>
-          <w:p>
-            <w:pPr>
-              <w:spacing w:line="26" w:lineRule="atLeast"/>
+            <w:vAlign w:val="center"/>
+            <w:hideMark/>
+          </w:tcPr>
+          <w:p>
+            <w:pPr>
+              <w:spacing w:before="60" w:after="60" w:line="26" w:lineRule="atLeast"/>
               <w:jc w:val="both"/>
               <w:rPr>
                 <w:rFonts w:asciiTheme="majorHAnsi" w:eastAsia="Times New Roman" w:hAnsiTheme="majorHAnsi" w:cstheme="majorHAnsi"/>
@@ -2150,30 +2202,53 @@
                 <w:szCs w:val="26"/>
                 <w:lang w:val="vi-VN" w:eastAsia="vi-VN"/>
               </w:rPr>
-              <w:t>Phụ trách phần 2.5.2 triể</w:t>
-            </w:r>
-            <w:r>
-              <w:rPr>
-                <w:rFonts w:asciiTheme="majorHAnsi" w:eastAsia="Times New Roman" w:hAnsiTheme="majorHAnsi" w:cstheme="majorHAnsi"/>
-                <w:szCs w:val="26"/>
-                <w:lang w:eastAsia="vi-VN"/>
-              </w:rPr>
-              <w:t>n</w:t>
-            </w:r>
-            <w:r>
-              <w:rPr>
-                <w:rFonts w:asciiTheme="majorHAnsi" w:eastAsia="Times New Roman" w:hAnsiTheme="majorHAnsi" w:cstheme="majorHAnsi"/>
-                <w:szCs w:val="26"/>
-                <w:lang w:val="vi-VN" w:eastAsia="vi-VN"/>
-              </w:rPr>
-              <w:t xml:space="preserve"> khai hệ thống bằng C++</w:t>
+              <w:t xml:space="preserve">Phụ trách phần </w:t>
+            </w:r>
+            <w:r>
+              <w:rPr>
+                <w:rFonts w:asciiTheme="majorHAnsi" w:eastAsia="Times New Roman" w:hAnsiTheme="majorHAnsi" w:cstheme="majorHAnsi"/>
+                <w:szCs w:val="26"/>
+                <w:lang w:val="vi-VN" w:eastAsia="vi-VN"/>
+              </w:rPr>
+              <w:t>xử lý</w:t>
+            </w:r>
+            <w:r>
+              <w:rPr>
+                <w:rFonts w:asciiTheme="majorHAnsi" w:eastAsia="Times New Roman" w:hAnsiTheme="majorHAnsi" w:cstheme="majorHAnsi"/>
+                <w:szCs w:val="26"/>
+                <w:lang w:val="vi-VN" w:eastAsia="vi-VN"/>
+              </w:rPr>
+              <w:t xml:space="preserve"> đầu vào và đầu ra bằng</w:t>
+            </w:r>
+            <w:r>
+              <w:rPr>
+                <w:rFonts w:asciiTheme="majorHAnsi" w:eastAsia="Times New Roman" w:hAnsiTheme="majorHAnsi" w:cstheme="majorHAnsi"/>
+                <w:szCs w:val="26"/>
+                <w:lang w:val="vi-VN" w:eastAsia="vi-VN"/>
+              </w:rPr>
+              <w:t xml:space="preserve"> file</w:t>
+            </w:r>
+            <w:r>
+              <w:rPr>
+                <w:rFonts w:asciiTheme="majorHAnsi" w:eastAsia="Times New Roman" w:hAnsiTheme="majorHAnsi" w:cstheme="majorHAnsi"/>
+                <w:szCs w:val="26"/>
+                <w:lang w:val="vi-VN" w:eastAsia="vi-VN"/>
+              </w:rPr>
+              <w:t xml:space="preserve">, xử lý và lưu khóa trong code </w:t>
+            </w:r>
+            <w:r>
+              <w:rPr>
+                <w:rFonts w:asciiTheme="majorHAnsi" w:eastAsia="Times New Roman" w:hAnsiTheme="majorHAnsi" w:cstheme="majorHAnsi"/>
+                <w:szCs w:val="26"/>
+                <w:lang w:val="vi-VN" w:eastAsia="vi-VN"/>
+              </w:rPr>
+              <w:t>C++</w:t>
             </w:r>
           </w:p>
         </w:tc>
         <w:tc>
           <w:tcPr>
             <w:tcW w:w="1978" w:type="pct"/>
-            <w:vMerge w:val="restart"/>
             <w:tcBorders>
               <w:right w:val="single" w:sz="8" w:space="0" w:color="auto"/>
             </w:tcBorders>
@@ -2181,7 +2256,7 @@
           </w:tcPr>
           <w:p>
             <w:pPr>
-              <w:spacing w:line="26" w:lineRule="atLeast"/>
+              <w:spacing w:before="60" w:after="60" w:line="26" w:lineRule="atLeast"/>
               <w:jc w:val="both"/>
               <w:rPr>
                 <w:rFonts w:asciiTheme="majorHAnsi" w:eastAsia="Times New Roman" w:hAnsiTheme="majorHAnsi" w:cstheme="majorHAnsi"/>
@@ -2195,7 +2270,7 @@
                 <w:szCs w:val="26"/>
                 <w:lang w:val="vi-VN" w:eastAsia="vi-VN"/>
               </w:rPr>
-              <w:t>Sử dụng C++, GMP và OpenSSL để triển khai thuật toán DSA, xây dựng menu chương trình và các chức năng ký số, xác thực chữ ký trên file.</w:t>
+              <w:t>Tìm hiểu cách thao tác file trong C++, xây dựng chức năng đọc/ghi dữ liệu, lưu khóa công khai và khóa bí mật dưới dạng file, kiểm tra tính toàn vẹn dữ liệu trong quá trình xử lý.</w:t>
             </w:r>
           </w:p>
         </w:tc>
@@ -2216,7 +2291,7 @@
           </w:tcPr>
           <w:p>
             <w:pPr>
-              <w:spacing w:line="26" w:lineRule="atLeast"/>
+              <w:spacing w:before="60" w:after="60" w:line="26" w:lineRule="atLeast"/>
               <w:jc w:val="center"/>
               <w:rPr>
                 <w:rFonts w:asciiTheme="majorHAnsi" w:eastAsia="Times New Roman" w:hAnsiTheme="majorHAnsi" w:cstheme="majorHAnsi"/>
@@ -2237,7 +2312,7 @@
           </w:tcPr>
           <w:p>
             <w:pPr>
-              <w:spacing w:line="26" w:lineRule="atLeast"/>
+              <w:spacing w:before="60" w:after="60" w:line="26" w:lineRule="atLeast"/>
               <w:rPr>
                 <w:rFonts w:asciiTheme="majorHAnsi" w:eastAsia="Times New Roman" w:hAnsiTheme="majorHAnsi" w:cstheme="majorHAnsi"/>
                 <w:szCs w:val="26"/>
@@ -2257,7 +2332,6 @@
         <w:tc>
           <w:tcPr>
             <w:tcW w:w="1931" w:type="pct"/>
-            <w:vMerge/>
             <w:tcBorders>
               <w:bottom w:val="single" w:sz="8" w:space="0" w:color="auto"/>
             </w:tcBorders>
@@ -2266,7 +2340,7 @@
           </w:tcPr>
           <w:p>
             <w:pPr>
-              <w:spacing w:line="26" w:lineRule="atLeast"/>
+              <w:spacing w:before="60" w:after="60" w:line="26" w:lineRule="atLeast"/>
               <w:jc w:val="both"/>
               <w:rPr>
                 <w:rFonts w:asciiTheme="majorHAnsi" w:eastAsia="Times New Roman" w:hAnsiTheme="majorHAnsi" w:cstheme="majorHAnsi"/>
@@ -2274,12 +2348,19 @@
                 <w:lang w:val="vi-VN" w:eastAsia="vi-VN"/>
               </w:rPr>
             </w:pPr>
+            <w:r>
+              <w:rPr>
+                <w:rFonts w:asciiTheme="majorHAnsi" w:eastAsia="Times New Roman" w:hAnsiTheme="majorHAnsi" w:cstheme="majorHAnsi"/>
+                <w:szCs w:val="26"/>
+                <w:lang w:val="vi-VN" w:eastAsia="vi-VN"/>
+              </w:rPr>
+              <w:t>Xây dựng mã hóa và giải mã bằng JAVA</w:t>
+            </w:r>
           </w:p>
         </w:tc>
         <w:tc>
           <w:tcPr>
             <w:tcW w:w="1978" w:type="pct"/>
-            <w:vMerge/>
             <w:tcBorders>
               <w:bottom w:val="single" w:sz="8" w:space="0" w:color="auto"/>
               <w:right w:val="single" w:sz="8" w:space="0" w:color="auto"/>
@@ -2289,7 +2370,7 @@
           </w:tcPr>
           <w:p>
             <w:pPr>
-              <w:spacing w:line="26" w:lineRule="atLeast"/>
+              <w:spacing w:before="60" w:after="60" w:line="26" w:lineRule="atLeast"/>
               <w:jc w:val="both"/>
               <w:rPr>
                 <w:rFonts w:asciiTheme="majorHAnsi" w:eastAsia="Times New Roman" w:hAnsiTheme="majorHAnsi" w:cstheme="majorHAnsi"/>
@@ -2297,6 +2378,14 @@
                 <w:lang w:val="vi-VN" w:eastAsia="vi-VN"/>
               </w:rPr>
             </w:pPr>
+            <w:r>
+              <w:rPr>
+                <w:rFonts w:asciiTheme="majorHAnsi" w:eastAsia="Times New Roman" w:hAnsiTheme="majorHAnsi" w:cstheme="majorHAnsi"/>
+                <w:szCs w:val="26"/>
+                <w:lang w:val="vi-VN" w:eastAsia="vi-VN"/>
+              </w:rPr>
+              <w:t>Sử dụng Java và các thư viện bảo mật để xây dựng chức năng mã hóa, giải mã và xác thực dữ liệu, tham khảo tài liệu thuật toán DSA và kiểm thử bằng nhiều bộ dữ liệu khác nhau.</w:t>
+            </w:r>
           </w:p>
         </w:tc>
       </w:tr>
@@ -2317,7 +2406,7 @@
           </w:tcPr>
           <w:p>
             <w:pPr>
-              <w:spacing w:line="26" w:lineRule="atLeast"/>
+              <w:spacing w:before="60" w:after="60" w:line="26" w:lineRule="atLeast"/>
               <w:jc w:val="center"/>
               <w:rPr>
                 <w:rFonts w:asciiTheme="majorHAnsi" w:eastAsia="Times New Roman" w:hAnsiTheme="majorHAnsi" w:cstheme="majorHAnsi"/>
@@ -2346,7 +2435,7 @@
           </w:tcPr>
           <w:p>
             <w:pPr>
-              <w:spacing w:line="26" w:lineRule="atLeast"/>
+              <w:spacing w:before="60" w:after="60" w:line="26" w:lineRule="atLeast"/>
               <w:rPr>
                 <w:rFonts w:asciiTheme="majorHAnsi" w:eastAsia="Times New Roman" w:hAnsiTheme="majorHAnsi" w:cstheme="majorHAnsi"/>
                 <w:szCs w:val="26"/>
@@ -2366,7 +2455,6 @@
         <w:tc>
           <w:tcPr>
             <w:tcW w:w="1931" w:type="pct"/>
-            <w:vMerge w:val="restart"/>
             <w:tcBorders>
               <w:top w:val="single" w:sz="8" w:space="0" w:color="auto"/>
             </w:tcBorders>
@@ -2375,7 +2463,7 @@
           </w:tcPr>
           <w:p>
             <w:pPr>
-              <w:spacing w:line="26" w:lineRule="atLeast"/>
+              <w:spacing w:before="60" w:after="60" w:line="26" w:lineRule="atLeast"/>
               <w:jc w:val="both"/>
               <w:rPr>
                 <w:rFonts w:asciiTheme="majorHAnsi" w:eastAsia="Times New Roman" w:hAnsiTheme="majorHAnsi" w:cstheme="majorHAnsi"/>
@@ -2389,14 +2477,13 @@
                 <w:szCs w:val="26"/>
                 <w:lang w:val="vi-VN" w:eastAsia="vi-VN"/>
               </w:rPr>
-              <w:t>Phụ trách phần 2.6 Kiểm thử và đánh giá hệ thống</w:t>
+              <w:t>Phụ trách kiểm thử hệ thống C++</w:t>
             </w:r>
           </w:p>
         </w:tc>
         <w:tc>
           <w:tcPr>
             <w:tcW w:w="1978" w:type="pct"/>
-            <w:vMerge w:val="restart"/>
             <w:tcBorders>
               <w:top w:val="single" w:sz="8" w:space="0" w:color="auto"/>
               <w:right w:val="single" w:sz="8" w:space="0" w:color="auto"/>
@@ -2406,7 +2493,7 @@
           </w:tcPr>
           <w:p>
             <w:pPr>
-              <w:spacing w:line="26" w:lineRule="atLeast"/>
+              <w:spacing w:before="60" w:after="60" w:line="26" w:lineRule="atLeast"/>
               <w:jc w:val="both"/>
               <w:rPr>
                 <w:rFonts w:asciiTheme="majorHAnsi" w:eastAsia="Times New Roman" w:hAnsiTheme="majorHAnsi" w:cstheme="majorHAnsi"/>
@@ -2420,7 +2507,15 @@
                 <w:szCs w:val="26"/>
                 <w:lang w:val="vi-VN" w:eastAsia="vi-VN"/>
               </w:rPr>
-              <w:t>Thực hiện kiểm thử chương trình với nhiều loại file khác nhau, ghi nhận kết quả thực nghiệm, đánh giá tính toàn vẹn dữ liệu và so sánh hiệu năng giữa Java và C++.</w:t>
+              <w:t xml:space="preserve">Thực hiện kiểm thử chương trình với nhiều loại file khác nhau, ghi nhận kết quả thực nghiệm, đánh giá tính toàn vẹn dữ liệu </w:t>
+            </w:r>
+            <w:r>
+              <w:rPr>
+                <w:rFonts w:asciiTheme="majorHAnsi" w:eastAsia="Times New Roman" w:hAnsiTheme="majorHAnsi" w:cstheme="majorHAnsi"/>
+                <w:szCs w:val="26"/>
+                <w:lang w:val="vi-VN" w:eastAsia="vi-VN"/>
+              </w:rPr>
+              <w:t>của hệ thống C++</w:t>
             </w:r>
           </w:p>
         </w:tc>
@@ -2441,7 +2536,7 @@
           </w:tcPr>
           <w:p>
             <w:pPr>
-              <w:spacing w:line="26" w:lineRule="atLeast"/>
+              <w:spacing w:before="60" w:after="60" w:line="26" w:lineRule="atLeast"/>
               <w:jc w:val="center"/>
               <w:rPr>
                 <w:rFonts w:asciiTheme="majorHAnsi" w:eastAsia="Times New Roman" w:hAnsiTheme="majorHAnsi" w:cstheme="majorHAnsi"/>
@@ -2459,7 +2554,7 @@
           </w:tcPr>
           <w:p>
             <w:pPr>
-              <w:spacing w:line="26" w:lineRule="atLeast"/>
+              <w:spacing w:before="60" w:after="60" w:line="26" w:lineRule="atLeast"/>
               <w:rPr>
                 <w:rFonts w:asciiTheme="majorHAnsi" w:eastAsia="Times New Roman" w:hAnsiTheme="majorHAnsi" w:cstheme="majorHAnsi"/>
                 <w:szCs w:val="26"/>
@@ -2479,13 +2574,12 @@
         <w:tc>
           <w:tcPr>
             <w:tcW w:w="1931" w:type="pct"/>
-            <w:vMerge/>
-            <w:vAlign w:val="center"/>
-            <w:hideMark/>
-          </w:tcPr>
-          <w:p>
-            <w:pPr>
-              <w:spacing w:line="26" w:lineRule="atLeast"/>
+            <w:vAlign w:val="center"/>
+            <w:hideMark/>
+          </w:tcPr>
+          <w:p>
+            <w:pPr>
+              <w:spacing w:before="60" w:after="60" w:line="26" w:lineRule="atLeast"/>
               <w:jc w:val="both"/>
               <w:rPr>
                 <w:rFonts w:asciiTheme="majorHAnsi" w:eastAsia="Times New Roman" w:hAnsiTheme="majorHAnsi" w:cstheme="majorHAnsi"/>
@@ -2493,12 +2587,27 @@
                 <w:lang w:val="vi-VN" w:eastAsia="vi-VN"/>
               </w:rPr>
             </w:pPr>
+            <w:r>
+              <w:rPr>
+                <w:rFonts w:asciiTheme="majorHAnsi" w:eastAsia="Times New Roman" w:hAnsiTheme="majorHAnsi" w:cstheme="majorHAnsi"/>
+                <w:szCs w:val="26"/>
+                <w:lang w:val="vi-VN" w:eastAsia="vi-VN"/>
+              </w:rPr>
+              <w:t xml:space="preserve">Phụ trách kiểm thử hệ thống </w:t>
+            </w:r>
+            <w:r>
+              <w:rPr>
+                <w:rFonts w:asciiTheme="majorHAnsi" w:eastAsia="Times New Roman" w:hAnsiTheme="majorHAnsi" w:cstheme="majorHAnsi"/>
+                <w:szCs w:val="26"/>
+                <w:lang w:val="vi-VN" w:eastAsia="vi-VN"/>
+              </w:rPr>
+              <w:t>JAVA</w:t>
+            </w:r>
           </w:p>
         </w:tc>
         <w:tc>
           <w:tcPr>
             <w:tcW w:w="1978" w:type="pct"/>
-            <w:vMerge/>
             <w:tcBorders>
               <w:right w:val="single" w:sz="8" w:space="0" w:color="auto"/>
             </w:tcBorders>
@@ -2507,7 +2616,7 @@
           </w:tcPr>
           <w:p>
             <w:pPr>
-              <w:spacing w:line="26" w:lineRule="atLeast"/>
+              <w:spacing w:before="60" w:after="60" w:line="26" w:lineRule="atLeast"/>
               <w:jc w:val="both"/>
               <w:rPr>
                 <w:rFonts w:asciiTheme="majorHAnsi" w:eastAsia="Times New Roman" w:hAnsiTheme="majorHAnsi" w:cstheme="majorHAnsi"/>
@@ -2515,6 +2624,14 @@
                 <w:lang w:val="vi-VN" w:eastAsia="vi-VN"/>
               </w:rPr>
             </w:pPr>
+            <w:r>
+              <w:rPr>
+                <w:rFonts w:asciiTheme="majorHAnsi" w:eastAsia="Times New Roman" w:hAnsiTheme="majorHAnsi" w:cstheme="majorHAnsi"/>
+                <w:szCs w:val="26"/>
+                <w:lang w:val="vi-VN" w:eastAsia="vi-VN"/>
+              </w:rPr>
+              <w:t>Tiến hành chạy các test case để hoàn thiện hệ thống JAVA</w:t>
+            </w:r>
           </w:p>
         </w:tc>
       </w:tr>
@@ -2534,7 +2651,7 @@
           </w:tcPr>
           <w:p>
             <w:pPr>
-              <w:spacing w:line="26" w:lineRule="atLeast"/>
+              <w:spacing w:before="60" w:after="60" w:line="26" w:lineRule="atLeast"/>
               <w:jc w:val="center"/>
               <w:rPr>
                 <w:rFonts w:asciiTheme="majorHAnsi" w:eastAsia="Times New Roman" w:hAnsiTheme="majorHAnsi" w:cstheme="majorHAnsi"/>
@@ -2552,7 +2669,7 @@
           </w:tcPr>
           <w:p>
             <w:pPr>
-              <w:spacing w:line="26" w:lineRule="atLeast"/>
+              <w:spacing w:before="60" w:after="60" w:line="26" w:lineRule="atLeast"/>
               <w:rPr>
                 <w:rFonts w:asciiTheme="majorHAnsi" w:eastAsia="Times New Roman" w:hAnsiTheme="majorHAnsi" w:cstheme="majorHAnsi"/>
                 <w:szCs w:val="26"/>
@@ -2572,13 +2689,12 @@
         <w:tc>
           <w:tcPr>
             <w:tcW w:w="1931" w:type="pct"/>
-            <w:vMerge w:val="restart"/>
-            <w:vAlign w:val="center"/>
-            <w:hideMark/>
-          </w:tcPr>
-          <w:p>
-            <w:pPr>
-              <w:spacing w:line="26" w:lineRule="atLeast"/>
+            <w:vAlign w:val="center"/>
+            <w:hideMark/>
+          </w:tcPr>
+          <w:p>
+            <w:pPr>
+              <w:spacing w:before="60" w:after="60" w:line="26" w:lineRule="atLeast"/>
               <w:jc w:val="both"/>
               <w:rPr>
                 <w:rFonts w:asciiTheme="majorHAnsi" w:eastAsia="Times New Roman" w:hAnsiTheme="majorHAnsi" w:cstheme="majorHAnsi"/>
@@ -2592,14 +2708,13 @@
                 <w:szCs w:val="26"/>
                 <w:lang w:val="vi-VN" w:eastAsia="vi-VN"/>
               </w:rPr>
-              <w:t>Hoàn thiện chương 3</w:t>
+              <w:t>Phụ trách hoàn thiện 3.1 các kết quả đạt được</w:t>
             </w:r>
           </w:p>
         </w:tc>
         <w:tc>
           <w:tcPr>
             <w:tcW w:w="1978" w:type="pct"/>
-            <w:vMerge w:val="restart"/>
             <w:tcBorders>
               <w:right w:val="single" w:sz="8" w:space="0" w:color="auto"/>
             </w:tcBorders>
@@ -2608,7 +2723,7 @@
           </w:tcPr>
           <w:p>
             <w:pPr>
-              <w:spacing w:line="26" w:lineRule="atLeast"/>
+              <w:spacing w:before="60" w:after="60" w:line="26" w:lineRule="atLeast"/>
               <w:jc w:val="both"/>
               <w:rPr>
                 <w:rFonts w:asciiTheme="majorHAnsi" w:eastAsia="Times New Roman" w:hAnsiTheme="majorHAnsi" w:cstheme="majorHAnsi"/>
@@ -2643,7 +2758,7 @@
           </w:tcPr>
           <w:p>
             <w:pPr>
-              <w:spacing w:line="26" w:lineRule="atLeast"/>
+              <w:spacing w:before="60" w:after="60" w:line="26" w:lineRule="atLeast"/>
               <w:jc w:val="center"/>
               <w:rPr>
                 <w:rFonts w:asciiTheme="majorHAnsi" w:eastAsia="Times New Roman" w:hAnsiTheme="majorHAnsi" w:cstheme="majorHAnsi"/>
@@ -2661,7 +2776,7 @@
           </w:tcPr>
           <w:p>
             <w:pPr>
-              <w:spacing w:line="26" w:lineRule="atLeast"/>
+              <w:spacing w:before="60" w:after="60" w:line="26" w:lineRule="atLeast"/>
               <w:rPr>
                 <w:rFonts w:asciiTheme="majorHAnsi" w:eastAsia="Times New Roman" w:hAnsiTheme="majorHAnsi" w:cstheme="majorHAnsi"/>
                 <w:szCs w:val="26"/>
@@ -2681,13 +2796,12 @@
         <w:tc>
           <w:tcPr>
             <w:tcW w:w="1931" w:type="pct"/>
-            <w:vMerge/>
-            <w:vAlign w:val="center"/>
-            <w:hideMark/>
-          </w:tcPr>
-          <w:p>
-            <w:pPr>
-              <w:spacing w:line="26" w:lineRule="atLeast"/>
+            <w:vAlign w:val="center"/>
+            <w:hideMark/>
+          </w:tcPr>
+          <w:p>
+            <w:pPr>
+              <w:spacing w:before="60" w:after="60" w:line="26" w:lineRule="atLeast"/>
               <w:jc w:val="both"/>
               <w:rPr>
                 <w:rFonts w:asciiTheme="majorHAnsi" w:eastAsia="Times New Roman" w:hAnsiTheme="majorHAnsi" w:cstheme="majorHAnsi"/>
@@ -2695,12 +2809,61 @@
                 <w:lang w:val="vi-VN" w:eastAsia="vi-VN"/>
               </w:rPr>
             </w:pPr>
+            <w:r>
+              <w:rPr>
+                <w:rFonts w:asciiTheme="majorHAnsi" w:eastAsia="Times New Roman" w:hAnsiTheme="majorHAnsi" w:cstheme="majorHAnsi"/>
+                <w:szCs w:val="26"/>
+                <w:lang w:val="vi-VN" w:eastAsia="vi-VN"/>
+              </w:rPr>
+              <w:t>Phụ trách hoàn thiện 3.</w:t>
+            </w:r>
+            <w:r>
+              <w:rPr>
+                <w:rFonts w:asciiTheme="majorHAnsi" w:eastAsia="Times New Roman" w:hAnsiTheme="majorHAnsi" w:cstheme="majorHAnsi"/>
+                <w:szCs w:val="26"/>
+                <w:lang w:val="vi-VN" w:eastAsia="vi-VN"/>
+              </w:rPr>
+              <w:t>2</w:t>
+            </w:r>
+            <w:r>
+              <w:rPr>
+                <w:rFonts w:asciiTheme="majorHAnsi" w:eastAsia="Times New Roman" w:hAnsiTheme="majorHAnsi" w:cstheme="majorHAnsi"/>
+                <w:szCs w:val="26"/>
+                <w:lang w:val="vi-VN" w:eastAsia="vi-VN"/>
+              </w:rPr>
+              <w:t xml:space="preserve"> </w:t>
+            </w:r>
+            <w:r>
+              <w:rPr>
+                <w:rFonts w:asciiTheme="majorHAnsi" w:eastAsia="Times New Roman" w:hAnsiTheme="majorHAnsi" w:cstheme="majorHAnsi"/>
+                <w:szCs w:val="26"/>
+                <w:lang w:val="vi-VN" w:eastAsia="vi-VN"/>
+              </w:rPr>
+              <w:t xml:space="preserve">tổng hợp các khó khăn và bài </w:t>
+            </w:r>
+            <w:proofErr w:type="spellStart"/>
+            <w:r>
+              <w:rPr>
+                <w:rFonts w:asciiTheme="majorHAnsi" w:eastAsia="Times New Roman" w:hAnsiTheme="majorHAnsi" w:cstheme="majorHAnsi"/>
+                <w:szCs w:val="26"/>
+                <w:lang w:val="vi-VN" w:eastAsia="vi-VN"/>
+              </w:rPr>
+              <w:t>hợn</w:t>
+            </w:r>
+            <w:proofErr w:type="spellEnd"/>
+            <w:r>
+              <w:rPr>
+                <w:rFonts w:asciiTheme="majorHAnsi" w:eastAsia="Times New Roman" w:hAnsiTheme="majorHAnsi" w:cstheme="majorHAnsi"/>
+                <w:szCs w:val="26"/>
+                <w:lang w:val="vi-VN" w:eastAsia="vi-VN"/>
+              </w:rPr>
+              <w:t xml:space="preserve"> kinh nghiệm</w:t>
+            </w:r>
           </w:p>
         </w:tc>
         <w:tc>
           <w:tcPr>
             <w:tcW w:w="1978" w:type="pct"/>
-            <w:vMerge/>
             <w:tcBorders>
               <w:right w:val="single" w:sz="8" w:space="0" w:color="auto"/>
             </w:tcBorders>
@@ -2709,7 +2872,7 @@
           </w:tcPr>
           <w:p>
             <w:pPr>
-              <w:spacing w:line="26" w:lineRule="atLeast"/>
+              <w:spacing w:before="60" w:after="60" w:line="26" w:lineRule="atLeast"/>
               <w:jc w:val="both"/>
               <w:rPr>
                 <w:rFonts w:asciiTheme="majorHAnsi" w:eastAsia="Times New Roman" w:hAnsiTheme="majorHAnsi" w:cstheme="majorHAnsi"/>
@@ -2717,6 +2880,22 @@
                 <w:lang w:val="vi-VN" w:eastAsia="vi-VN"/>
               </w:rPr>
             </w:pPr>
+            <w:r>
+              <w:rPr>
+                <w:rFonts w:asciiTheme="majorHAnsi" w:eastAsia="Times New Roman" w:hAnsiTheme="majorHAnsi" w:cstheme="majorHAnsi"/>
+                <w:szCs w:val="26"/>
+                <w:lang w:val="vi-VN" w:eastAsia="vi-VN"/>
+              </w:rPr>
+              <w:t xml:space="preserve">Tổng hợp </w:t>
+            </w:r>
+            <w:r>
+              <w:rPr>
+                <w:rFonts w:asciiTheme="majorHAnsi" w:eastAsia="Times New Roman" w:hAnsiTheme="majorHAnsi" w:cstheme="majorHAnsi"/>
+                <w:szCs w:val="26"/>
+                <w:lang w:val="vi-VN" w:eastAsia="vi-VN"/>
+              </w:rPr>
+              <w:t>các khó khan của nhóm trong quá trình tìm hiểu và phát triển đề tài</w:t>
+            </w:r>
           </w:p>
         </w:tc>
       </w:tr>
@@ -2737,7 +2916,7 @@
           </w:tcPr>
           <w:p>
             <w:pPr>
-              <w:spacing w:line="26" w:lineRule="atLeast"/>
+              <w:spacing w:before="60" w:after="60" w:line="26" w:lineRule="atLeast"/>
               <w:jc w:val="center"/>
               <w:rPr>
                 <w:rFonts w:asciiTheme="majorHAnsi" w:eastAsia="Times New Roman" w:hAnsiTheme="majorHAnsi" w:cstheme="majorHAnsi"/>
@@ -2758,7 +2937,7 @@
           </w:tcPr>
           <w:p>
             <w:pPr>
-              <w:spacing w:line="26" w:lineRule="atLeast"/>
+              <w:spacing w:before="60" w:after="60" w:line="26" w:lineRule="atLeast"/>
               <w:rPr>
                 <w:rFonts w:asciiTheme="majorHAnsi" w:eastAsia="Times New Roman" w:hAnsiTheme="majorHAnsi" w:cstheme="majorHAnsi"/>
                 <w:szCs w:val="26"/>
@@ -2778,7 +2957,6 @@
         <w:tc>
           <w:tcPr>
             <w:tcW w:w="1931" w:type="pct"/>
-            <w:vMerge/>
             <w:tcBorders>
               <w:bottom w:val="single" w:sz="8" w:space="0" w:color="auto"/>
             </w:tcBorders>
@@ -2787,7 +2965,7 @@
           </w:tcPr>
           <w:p>
             <w:pPr>
-              <w:spacing w:line="26" w:lineRule="atLeast"/>
+              <w:spacing w:before="60" w:after="60" w:line="26" w:lineRule="atLeast"/>
               <w:jc w:val="both"/>
               <w:rPr>
                 <w:rFonts w:asciiTheme="majorHAnsi" w:eastAsia="Times New Roman" w:hAnsiTheme="majorHAnsi" w:cstheme="majorHAnsi"/>
@@ -2795,12 +2973,19 @@
                 <w:lang w:val="vi-VN" w:eastAsia="vi-VN"/>
               </w:rPr>
             </w:pPr>
+            <w:r>
+              <w:rPr>
+                <w:rFonts w:asciiTheme="majorHAnsi" w:eastAsia="Times New Roman" w:hAnsiTheme="majorHAnsi" w:cstheme="majorHAnsi"/>
+                <w:szCs w:val="26"/>
+                <w:lang w:val="vi-VN" w:eastAsia="vi-VN"/>
+              </w:rPr>
+              <w:t>Phụ trách hoàn thiện 3.3 Các đề xuất và hướng phát triển của đề tài</w:t>
+            </w:r>
           </w:p>
         </w:tc>
         <w:tc>
           <w:tcPr>
             <w:tcW w:w="1978" w:type="pct"/>
-            <w:vMerge/>
             <w:tcBorders>
               <w:bottom w:val="single" w:sz="8" w:space="0" w:color="auto"/>
               <w:right w:val="single" w:sz="8" w:space="0" w:color="auto"/>
@@ -2810,7 +2995,7 @@
           </w:tcPr>
           <w:p>
             <w:pPr>
-              <w:spacing w:line="26" w:lineRule="atLeast"/>
+              <w:spacing w:before="60" w:after="60" w:line="26" w:lineRule="atLeast"/>
               <w:jc w:val="both"/>
               <w:rPr>
                 <w:rFonts w:asciiTheme="majorHAnsi" w:eastAsia="Times New Roman" w:hAnsiTheme="majorHAnsi" w:cstheme="majorHAnsi"/>
@@ -2818,6 +3003,30 @@
                 <w:lang w:val="vi-VN" w:eastAsia="vi-VN"/>
               </w:rPr>
             </w:pPr>
+            <w:r>
+              <w:rPr>
+                <w:rFonts w:asciiTheme="majorHAnsi" w:eastAsia="Times New Roman" w:hAnsiTheme="majorHAnsi" w:cstheme="majorHAnsi"/>
+                <w:szCs w:val="26"/>
+                <w:lang w:val="vi-VN" w:eastAsia="vi-VN"/>
+              </w:rPr>
+              <w:t xml:space="preserve">Tổng hợp </w:t>
+            </w:r>
+            <w:r>
+              <w:rPr>
+                <w:rFonts w:asciiTheme="majorHAnsi" w:eastAsia="Times New Roman" w:hAnsiTheme="majorHAnsi" w:cstheme="majorHAnsi"/>
+                <w:szCs w:val="26"/>
+                <w:lang w:val="vi-VN" w:eastAsia="vi-VN"/>
+              </w:rPr>
+              <w:t>đề xuất</w:t>
+            </w:r>
+            <w:r>
+              <w:rPr>
+                <w:rFonts w:asciiTheme="majorHAnsi" w:eastAsia="Times New Roman" w:hAnsiTheme="majorHAnsi" w:cstheme="majorHAnsi"/>
+                <w:szCs w:val="26"/>
+                <w:lang w:val="vi-VN" w:eastAsia="vi-VN"/>
+              </w:rPr>
+              <w:t xml:space="preserve"> của nhóm trong quá trình tìm hiểu và phát triển đề tài</w:t>
+            </w:r>
           </w:p>
         </w:tc>
       </w:tr>
@@ -2838,7 +3047,7 @@
           </w:tcPr>
           <w:p>
             <w:pPr>
-              <w:spacing w:line="26" w:lineRule="atLeast"/>
+              <w:spacing w:before="60" w:after="60" w:line="26" w:lineRule="atLeast"/>
               <w:jc w:val="center"/>
               <w:rPr>
                 <w:rFonts w:asciiTheme="majorHAnsi" w:eastAsia="Times New Roman" w:hAnsiTheme="majorHAnsi" w:cstheme="majorHAnsi"/>
@@ -2867,7 +3076,7 @@
           </w:tcPr>
           <w:p>
             <w:pPr>
-              <w:spacing w:line="26" w:lineRule="atLeast"/>
+              <w:spacing w:before="60" w:after="60" w:line="26" w:lineRule="atLeast"/>
               <w:rPr>
                 <w:rFonts w:asciiTheme="majorHAnsi" w:eastAsia="Times New Roman" w:hAnsiTheme="majorHAnsi" w:cstheme="majorHAnsi"/>
                 <w:szCs w:val="26"/>
@@ -2895,7 +3104,7 @@
           </w:tcPr>
           <w:p>
             <w:pPr>
-              <w:spacing w:line="26" w:lineRule="atLeast"/>
+              <w:spacing w:before="60" w:after="60" w:line="26" w:lineRule="atLeast"/>
               <w:jc w:val="both"/>
               <w:rPr>
                 <w:rFonts w:asciiTheme="majorHAnsi" w:eastAsia="Times New Roman" w:hAnsiTheme="majorHAnsi" w:cstheme="majorHAnsi"/>
@@ -2925,7 +3134,7 @@
           </w:tcPr>
           <w:p>
             <w:pPr>
-              <w:spacing w:line="26" w:lineRule="atLeast"/>
+              <w:spacing w:before="60" w:after="60" w:line="26" w:lineRule="atLeast"/>
               <w:jc w:val="both"/>
               <w:rPr>
                 <w:rFonts w:asciiTheme="majorHAnsi" w:eastAsia="Times New Roman" w:hAnsiTheme="majorHAnsi" w:cstheme="majorHAnsi"/>
@@ -2939,15 +3148,7 @@
                 <w:szCs w:val="26"/>
                 <w:lang w:val="vi-VN" w:eastAsia="vi-VN"/>
               </w:rPr>
-              <w:t>T</w:t>
-            </w:r>
-            <w:r>
-              <w:rPr>
-                <w:rFonts w:asciiTheme="majorHAnsi" w:eastAsia="Times New Roman" w:hAnsiTheme="majorHAnsi" w:cstheme="majorHAnsi"/>
-                <w:szCs w:val="26"/>
-                <w:lang w:val="vi-VN" w:eastAsia="vi-VN"/>
-              </w:rPr>
-              <w:t>ổng hợp toàn bộ nội dung báo cáo từ các thành viên, chỉnh sửa định dạng, kiểm tra tính thống nhất và hoàn thiện bản báo cáo cuối cùng.</w:t>
+              <w:t>Tổng hợp toàn bộ nội dung báo cáo từ các thành viên, chỉnh sửa định dạng, kiểm tra tính thống nhất và hoàn thiện bản báo cáo cuối cùng.</w:t>
             </w:r>
           </w:p>
         </w:tc>
@@ -2968,7 +3169,7 @@
           </w:tcPr>
           <w:p>
             <w:pPr>
-              <w:spacing w:line="26" w:lineRule="atLeast"/>
+              <w:spacing w:before="60" w:after="60" w:line="26" w:lineRule="atLeast"/>
               <w:rPr>
                 <w:rFonts w:asciiTheme="majorHAnsi" w:eastAsia="Times New Roman" w:hAnsiTheme="majorHAnsi" w:cstheme="majorHAnsi"/>
                 <w:szCs w:val="26"/>
@@ -2985,7 +3186,7 @@
           </w:tcPr>
           <w:p>
             <w:pPr>
-              <w:spacing w:line="26" w:lineRule="atLeast"/>
+              <w:spacing w:before="60" w:after="60" w:line="26" w:lineRule="atLeast"/>
               <w:rPr>
                 <w:rFonts w:asciiTheme="majorHAnsi" w:eastAsia="Times New Roman" w:hAnsiTheme="majorHAnsi" w:cstheme="majorHAnsi"/>
                 <w:szCs w:val="26"/>
@@ -3005,13 +3206,12 @@
         <w:tc>
           <w:tcPr>
             <w:tcW w:w="1931" w:type="pct"/>
-            <w:vMerge w:val="restart"/>
-            <w:vAlign w:val="center"/>
-            <w:hideMark/>
-          </w:tcPr>
-          <w:p>
-            <w:pPr>
-              <w:spacing w:line="26" w:lineRule="atLeast"/>
+            <w:vAlign w:val="center"/>
+            <w:hideMark/>
+          </w:tcPr>
+          <w:p>
+            <w:pPr>
+              <w:spacing w:before="60" w:after="60" w:line="26" w:lineRule="atLeast"/>
               <w:jc w:val="both"/>
               <w:rPr>
                 <w:rFonts w:asciiTheme="majorHAnsi" w:eastAsia="Times New Roman" w:hAnsiTheme="majorHAnsi" w:cstheme="majorHAnsi"/>
@@ -3025,14 +3225,21 @@
                 <w:szCs w:val="26"/>
                 <w:lang w:val="vi-VN" w:eastAsia="vi-VN"/>
               </w:rPr>
-              <w:t>Phụ trách tiếp tục kiểm thử và hoàn thiện sản phẩm DEMO</w:t>
+              <w:t xml:space="preserve">Phụ trách tiếp tục kiểm thử và hoàn thiện sản phẩm </w:t>
+            </w:r>
+            <w:r>
+              <w:rPr>
+                <w:rFonts w:asciiTheme="majorHAnsi" w:eastAsia="Times New Roman" w:hAnsiTheme="majorHAnsi" w:cstheme="majorHAnsi"/>
+                <w:szCs w:val="26"/>
+                <w:lang w:val="vi-VN" w:eastAsia="vi-VN"/>
+              </w:rPr>
+              <w:t>bằng JAVA</w:t>
             </w:r>
           </w:p>
         </w:tc>
         <w:tc>
           <w:tcPr>
             <w:tcW w:w="1978" w:type="pct"/>
-            <w:vMerge w:val="restart"/>
             <w:tcBorders>
               <w:right w:val="single" w:sz="8" w:space="0" w:color="auto"/>
             </w:tcBorders>
@@ -3041,7 +3248,7 @@
           </w:tcPr>
           <w:p>
             <w:pPr>
-              <w:spacing w:line="26" w:lineRule="atLeast"/>
+              <w:spacing w:before="60" w:after="60" w:line="26" w:lineRule="atLeast"/>
               <w:jc w:val="both"/>
               <w:rPr>
                 <w:rFonts w:asciiTheme="majorHAnsi" w:eastAsia="Times New Roman" w:hAnsiTheme="majorHAnsi" w:cstheme="majorHAnsi"/>
@@ -3076,7 +3283,7 @@
           </w:tcPr>
           <w:p>
             <w:pPr>
-              <w:spacing w:line="26" w:lineRule="atLeast"/>
+              <w:spacing w:before="60" w:after="60" w:line="26" w:lineRule="atLeast"/>
               <w:rPr>
                 <w:rFonts w:asciiTheme="majorHAnsi" w:eastAsia="Times New Roman" w:hAnsiTheme="majorHAnsi" w:cstheme="majorHAnsi"/>
                 <w:szCs w:val="26"/>
@@ -3093,7 +3300,7 @@
           </w:tcPr>
           <w:p>
             <w:pPr>
-              <w:spacing w:line="26" w:lineRule="atLeast"/>
+              <w:spacing w:before="60" w:after="60" w:line="26" w:lineRule="atLeast"/>
               <w:rPr>
                 <w:rFonts w:asciiTheme="majorHAnsi" w:eastAsia="Times New Roman" w:hAnsiTheme="majorHAnsi" w:cstheme="majorHAnsi"/>
                 <w:szCs w:val="26"/>
@@ -3113,13 +3320,12 @@
         <w:tc>
           <w:tcPr>
             <w:tcW w:w="1931" w:type="pct"/>
-            <w:vMerge/>
-            <w:vAlign w:val="center"/>
-            <w:hideMark/>
-          </w:tcPr>
-          <w:p>
-            <w:pPr>
-              <w:spacing w:line="26" w:lineRule="atLeast"/>
+            <w:vAlign w:val="center"/>
+            <w:hideMark/>
+          </w:tcPr>
+          <w:p>
+            <w:pPr>
+              <w:spacing w:before="60" w:after="60" w:line="26" w:lineRule="atLeast"/>
               <w:jc w:val="both"/>
               <w:rPr>
                 <w:rFonts w:asciiTheme="majorHAnsi" w:eastAsia="Times New Roman" w:hAnsiTheme="majorHAnsi" w:cstheme="majorHAnsi"/>
@@ -3127,12 +3333,19 @@
                 <w:lang w:val="vi-VN" w:eastAsia="vi-VN"/>
               </w:rPr>
             </w:pPr>
+            <w:r>
+              <w:rPr>
+                <w:rFonts w:asciiTheme="majorHAnsi" w:eastAsia="Times New Roman" w:hAnsiTheme="majorHAnsi" w:cstheme="majorHAnsi"/>
+                <w:szCs w:val="26"/>
+                <w:lang w:val="vi-VN" w:eastAsia="vi-VN"/>
+              </w:rPr>
+              <w:t>Phụ trách tiếp tục kiểm thử và hoàn thiện sản phẩm bằng JAVA</w:t>
+            </w:r>
           </w:p>
         </w:tc>
         <w:tc>
           <w:tcPr>
             <w:tcW w:w="1978" w:type="pct"/>
-            <w:vMerge/>
             <w:tcBorders>
               <w:right w:val="single" w:sz="8" w:space="0" w:color="auto"/>
             </w:tcBorders>
@@ -3141,7 +3354,7 @@
           </w:tcPr>
           <w:p>
             <w:pPr>
-              <w:spacing w:line="26" w:lineRule="atLeast"/>
+              <w:spacing w:before="60" w:after="60" w:line="26" w:lineRule="atLeast"/>
               <w:jc w:val="both"/>
               <w:rPr>
                 <w:rFonts w:asciiTheme="majorHAnsi" w:eastAsia="Times New Roman" w:hAnsiTheme="majorHAnsi" w:cstheme="majorHAnsi"/>
@@ -3149,6 +3362,14 @@
                 <w:lang w:val="vi-VN" w:eastAsia="vi-VN"/>
               </w:rPr>
             </w:pPr>
+            <w:r>
+              <w:rPr>
+                <w:rFonts w:asciiTheme="majorHAnsi" w:eastAsia="Times New Roman" w:hAnsiTheme="majorHAnsi" w:cstheme="majorHAnsi"/>
+                <w:szCs w:val="26"/>
+                <w:lang w:val="vi-VN" w:eastAsia="vi-VN"/>
+              </w:rPr>
+              <w:t>Tiếp tục chạy thử DEMO hệ thống, kiểm tra lỗi phát sinh và hỗ trợ hoàn thiện chương trình trước khi nộp.</w:t>
+            </w:r>
           </w:p>
         </w:tc>
       </w:tr>
@@ -3168,7 +3389,7 @@
           </w:tcPr>
           <w:p>
             <w:pPr>
-              <w:spacing w:line="26" w:lineRule="atLeast"/>
+              <w:spacing w:before="60" w:after="60" w:line="26" w:lineRule="atLeast"/>
               <w:rPr>
                 <w:rFonts w:asciiTheme="majorHAnsi" w:eastAsia="Times New Roman" w:hAnsiTheme="majorHAnsi" w:cstheme="majorHAnsi"/>
                 <w:szCs w:val="26"/>
@@ -3185,7 +3406,7 @@
           </w:tcPr>
           <w:p>
             <w:pPr>
-              <w:spacing w:line="26" w:lineRule="atLeast"/>
+              <w:spacing w:before="60" w:after="60" w:line="26" w:lineRule="atLeast"/>
               <w:rPr>
                 <w:rFonts w:asciiTheme="majorHAnsi" w:eastAsia="Times New Roman" w:hAnsiTheme="majorHAnsi" w:cstheme="majorHAnsi"/>
                 <w:szCs w:val="26"/>
@@ -3205,13 +3426,12 @@
         <w:tc>
           <w:tcPr>
             <w:tcW w:w="1931" w:type="pct"/>
-            <w:vMerge/>
-            <w:vAlign w:val="center"/>
-            <w:hideMark/>
-          </w:tcPr>
-          <w:p>
-            <w:pPr>
-              <w:spacing w:line="26" w:lineRule="atLeast"/>
+            <w:vAlign w:val="center"/>
+            <w:hideMark/>
+          </w:tcPr>
+          <w:p>
+            <w:pPr>
+              <w:spacing w:before="60" w:after="60" w:line="26" w:lineRule="atLeast"/>
               <w:jc w:val="both"/>
               <w:rPr>
                 <w:rFonts w:asciiTheme="majorHAnsi" w:eastAsia="Times New Roman" w:hAnsiTheme="majorHAnsi" w:cstheme="majorHAnsi"/>
@@ -3219,12 +3439,27 @@
                 <w:lang w:val="vi-VN" w:eastAsia="vi-VN"/>
               </w:rPr>
             </w:pPr>
+            <w:r>
+              <w:rPr>
+                <w:rFonts w:asciiTheme="majorHAnsi" w:eastAsia="Times New Roman" w:hAnsiTheme="majorHAnsi" w:cstheme="majorHAnsi"/>
+                <w:szCs w:val="26"/>
+                <w:lang w:val="vi-VN" w:eastAsia="vi-VN"/>
+              </w:rPr>
+              <w:t xml:space="preserve">Phụ trách tiếp tục kiểm thử và hoàn thiện sản phẩm </w:t>
+            </w:r>
+            <w:r>
+              <w:rPr>
+                <w:rFonts w:asciiTheme="majorHAnsi" w:eastAsia="Times New Roman" w:hAnsiTheme="majorHAnsi" w:cstheme="majorHAnsi"/>
+                <w:szCs w:val="26"/>
+                <w:lang w:val="vi-VN" w:eastAsia="vi-VN"/>
+              </w:rPr>
+              <w:t>bằng C++</w:t>
+            </w:r>
           </w:p>
         </w:tc>
         <w:tc>
           <w:tcPr>
             <w:tcW w:w="1978" w:type="pct"/>
-            <w:vMerge/>
             <w:tcBorders>
               <w:right w:val="single" w:sz="8" w:space="0" w:color="auto"/>
             </w:tcBorders>
@@ -3233,7 +3468,7 @@
           </w:tcPr>
           <w:p>
             <w:pPr>
-              <w:spacing w:line="26" w:lineRule="atLeast"/>
+              <w:spacing w:before="60" w:after="60" w:line="26" w:lineRule="atLeast"/>
               <w:jc w:val="both"/>
               <w:rPr>
                 <w:rFonts w:asciiTheme="majorHAnsi" w:eastAsia="Times New Roman" w:hAnsiTheme="majorHAnsi" w:cstheme="majorHAnsi"/>
@@ -3241,6 +3476,14 @@
                 <w:lang w:val="vi-VN" w:eastAsia="vi-VN"/>
               </w:rPr>
             </w:pPr>
+            <w:r>
+              <w:rPr>
+                <w:rFonts w:asciiTheme="majorHAnsi" w:eastAsia="Times New Roman" w:hAnsiTheme="majorHAnsi" w:cstheme="majorHAnsi"/>
+                <w:szCs w:val="26"/>
+                <w:lang w:val="vi-VN" w:eastAsia="vi-VN"/>
+              </w:rPr>
+              <w:t>Tiếp tục chạy thử DEMO hệ thống, kiểm tra lỗi phát sinh và hỗ trợ hoàn thiện chương trình trước khi nộp.</w:t>
+            </w:r>
           </w:p>
         </w:tc>
       </w:tr>
@@ -3261,7 +3504,7 @@
           </w:tcPr>
           <w:p>
             <w:pPr>
-              <w:spacing w:line="26" w:lineRule="atLeast"/>
+              <w:spacing w:before="60" w:after="60" w:line="26" w:lineRule="atLeast"/>
               <w:rPr>
                 <w:rFonts w:asciiTheme="majorHAnsi" w:eastAsia="Times New Roman" w:hAnsiTheme="majorHAnsi" w:cstheme="majorHAnsi"/>
                 <w:szCs w:val="26"/>
@@ -3281,7 +3524,7 @@
           </w:tcPr>
           <w:p>
             <w:pPr>
-              <w:spacing w:line="26" w:lineRule="atLeast"/>
+              <w:spacing w:before="60" w:after="60" w:line="26" w:lineRule="atLeast"/>
               <w:rPr>
                 <w:rFonts w:asciiTheme="majorHAnsi" w:eastAsia="Times New Roman" w:hAnsiTheme="majorHAnsi" w:cstheme="majorHAnsi"/>
                 <w:szCs w:val="26"/>
@@ -3309,7 +3552,7 @@
           </w:tcPr>
           <w:p>
             <w:pPr>
-              <w:spacing w:line="26" w:lineRule="atLeast"/>
+              <w:spacing w:before="60" w:after="60" w:line="26" w:lineRule="atLeast"/>
               <w:jc w:val="both"/>
               <w:rPr>
                 <w:rFonts w:asciiTheme="majorHAnsi" w:eastAsia="Times New Roman" w:hAnsiTheme="majorHAnsi" w:cstheme="majorHAnsi"/>
@@ -3339,7 +3582,7 @@
           </w:tcPr>
           <w:p>
             <w:pPr>
-              <w:spacing w:line="26" w:lineRule="atLeast"/>
+              <w:spacing w:before="60" w:after="60" w:line="26" w:lineRule="atLeast"/>
               <w:jc w:val="both"/>
               <w:rPr>
                 <w:rFonts w:asciiTheme="majorHAnsi" w:eastAsia="Times New Roman" w:hAnsiTheme="majorHAnsi" w:cstheme="majorHAnsi"/>

</xml_diff>